<commit_message>
ajustei posicao das caixas no template residencia propria
</commit_message>
<xml_diff>
--- a/resources/templates/residencia_propria_new.docx
+++ b/resources/templates/residencia_propria_new.docx
@@ -1,12 +1,12 @@
 
 <file path=word/document.xml><?xml version="1.0" encoding="utf-8"?>
-<w:document xmlns:o="urn:schemas-microsoft-com:office:office" xmlns:r="http://schemas.openxmlformats.org/officeDocument/2006/relationships" xmlns:v="urn:schemas-microsoft-com:vml" xmlns:w="http://schemas.openxmlformats.org/wordprocessingml/2006/main" xmlns:w10="urn:schemas-microsoft-com:office:word" xmlns:wp="http://schemas.openxmlformats.org/drawingml/2006/wordprocessingDrawing" xmlns:wps="http://schemas.microsoft.com/office/word/2010/wordprocessingShape" xmlns:wpg="http://schemas.microsoft.com/office/word/2010/wordprocessingGroup" xmlns:mc="http://schemas.openxmlformats.org/markup-compatibility/2006" xmlns:wp14="http://schemas.microsoft.com/office/word/2010/wordprocessingDrawing" xmlns:w14="http://schemas.microsoft.com/office/word/2010/wordml" xmlns:w15="http://schemas.microsoft.com/office/word/2012/wordml" mc:Ignorable="w14 wp14 w15">
+<w:document xmlns:o="urn:schemas-microsoft-com:office:office" xmlns:r="http://schemas.openxmlformats.org/officeDocument/2006/relationships" xmlns:v="urn:schemas-microsoft-com:vml" xmlns:w="http://schemas.openxmlformats.org/wordprocessingml/2006/main" xmlns:w10="urn:schemas-microsoft-com:office:word" xmlns:wp="http://schemas.openxmlformats.org/drawingml/2006/wordprocessingDrawing" xmlns:pic="http://schemas.openxmlformats.org/drawingml/2006/picture" xmlns:wps="http://schemas.microsoft.com/office/word/2010/wordprocessingShape" xmlns:wpg="http://schemas.microsoft.com/office/word/2010/wordprocessingGroup" xmlns:mc="http://schemas.openxmlformats.org/markup-compatibility/2006" xmlns:wp14="http://schemas.microsoft.com/office/word/2010/wordprocessingDrawing" xmlns:w14="http://schemas.microsoft.com/office/word/2010/wordml" xmlns:w15="http://schemas.microsoft.com/office/word/2012/wordml" mc:Ignorable="w14 wp14 w15">
   <w:body>
     <w:p>
       <w:pPr>
         <w:pStyle w:val="Normal"/>
         <w:spacing w:lineRule="auto" w:line="259" w:before="0" w:after="88"/>
-        <w:ind w:right="55"/>
+        <w:ind w:end="55"/>
         <w:jc w:val="center"/>
         <w:rPr/>
       </w:pPr>
@@ -23,33 +23,21 @@
       <w:pPr>
         <w:pStyle w:val="Normal"/>
         <w:spacing w:lineRule="auto" w:line="259" w:before="0" w:after="355"/>
-        <w:ind w:left="11"/>
+        <w:ind w:start="11"/>
         <w:jc w:val="center"/>
-        <w:rPr/>
-      </w:pPr>
-      <w:r>
-        <w:rPr>
-          <w:sz w:val="6"/>
-        </w:rPr>
-        <w:t xml:space="preserve"> </w:t>
-      </w:r>
-    </w:p>
-    <w:p>
-      <w:pPr>
-        <w:pStyle w:val="Normal"/>
         <w:rPr/>
       </w:pPr>
       <w:r>
         <mc:AlternateContent>
           <mc:Choice Requires="wps">
             <w:drawing>
-              <wp:anchor behindDoc="0" distT="0" distB="0" distL="0" distR="0" simplePos="0" locked="0" layoutInCell="1" allowOverlap="1" relativeHeight="2" wp14:anchorId="16F6CF6A">
+              <wp:anchor distT="0" distB="0" distL="0" distR="0" simplePos="0" relativeHeight="2" behindDoc="0" locked="0" layoutInCell="1" allowOverlap="1" wp14:anchorId="16F6CF6A">
                 <wp:simplePos x="0" y="0"/>
                 <wp:positionH relativeFrom="column">
                   <wp:posOffset>340360</wp:posOffset>
                 </wp:positionH>
                 <wp:positionV relativeFrom="paragraph">
-                  <wp:posOffset>-21590</wp:posOffset>
+                  <wp:posOffset>365125</wp:posOffset>
                 </wp:positionV>
                 <wp:extent cx="4675505" cy="270510"/>
                 <wp:effectExtent l="0" t="0" r="0" b="0"/>
@@ -82,7 +70,7 @@
                         <w:txbxContent>
                           <w:p>
                             <w:pPr>
-                              <w:pStyle w:val="Contedodoquadro"/>
+                              <w:pStyle w:val="Contedodoquadrouser"/>
                               <w:rPr/>
                             </w:pPr>
                             <w:r>
@@ -104,14 +92,14 @@
           </mc:Choice>
           <mc:Fallback>
             <w:pict>
-              <v:rect id="shape_0" ID="Caixa de Texto 1" path="m0,0l-2147483645,0l-2147483645,-2147483646l0,-2147483646xe" stroked="f" o:allowincell="f" style="position:absolute;margin-left:26.8pt;margin-top:-1.7pt;width:368.1pt;height:21.25pt;mso-wrap-style:square;v-text-anchor:top" wp14:anchorId="16F6CF6A">
+              <v:rect id="shape_0" stroked="f" o:allowincell="f" style="position:absolute;margin-left:26.8pt;margin-top:28.75pt;width:368.1pt;height:21.25pt;mso-wrap-style:square;v-text-anchor:top" wp14:anchorId="16F6CF6A">
                 <v:fill o:detectmouseclick="t" on="false"/>
                 <v:stroke color="#3465a4" joinstyle="round" endcap="flat"/>
                 <v:textbox>
                   <w:txbxContent>
                     <w:p>
                       <w:pPr>
-                        <w:pStyle w:val="Contedodoquadro"/>
+                        <w:pStyle w:val="Contedodoquadrouser"/>
                         <w:rPr/>
                       </w:pPr>
                       <w:r>
@@ -126,10 +114,24 @@
             </w:pict>
           </mc:Fallback>
         </mc:AlternateContent>
+      </w:r>
+      <w:r>
+        <w:rPr>
+          <w:sz w:val="6"/>
+        </w:rPr>
+        <w:t xml:space="preserve"> </w:t>
+      </w:r>
+    </w:p>
+    <w:p>
+      <w:pPr>
+        <w:pStyle w:val="Normal"/>
+        <w:rPr/>
+      </w:pPr>
+      <w:r>
         <mc:AlternateContent>
           <mc:Choice Requires="wps">
             <w:drawing>
-              <wp:anchor behindDoc="0" distT="0" distB="0" distL="0" distR="0" simplePos="0" locked="0" layoutInCell="1" allowOverlap="1" relativeHeight="4" wp14:anchorId="0A09468B">
+              <wp:anchor distT="0" distB="0" distL="0" distR="0" simplePos="0" relativeHeight="4" behindDoc="0" locked="0" layoutInCell="1" allowOverlap="1" wp14:anchorId="0A09468B">
                 <wp:simplePos x="0" y="0"/>
                 <wp:positionH relativeFrom="column">
                   <wp:posOffset>1039495</wp:posOffset>
@@ -168,7 +170,7 @@
                         <w:txbxContent>
                           <w:p>
                             <w:pPr>
-                              <w:pStyle w:val="Contedodoquadro"/>
+                              <w:pStyle w:val="Contedodoquadrouser"/>
                               <w:rPr/>
                             </w:pPr>
                             <w:r>
@@ -190,14 +192,14 @@
           </mc:Choice>
           <mc:Fallback>
             <w:pict>
-              <v:rect id="shape_0" ID="Caixa de Texto 2" path="m0,0l-2147483645,0l-2147483645,-2147483646l0,-2147483646xe" stroked="f" o:allowincell="f" style="position:absolute;margin-left:81.85pt;margin-top:23.85pt;width:105.25pt;height:21.7pt;mso-wrap-style:square;v-text-anchor:top" wp14:anchorId="0A09468B">
+              <v:rect id="shape_0" stroked="f" o:allowincell="f" style="position:absolute;margin-left:81.85pt;margin-top:23.85pt;width:105.25pt;height:21.7pt;mso-wrap-style:square;v-text-anchor:top" wp14:anchorId="0A09468B">
                 <v:fill o:detectmouseclick="t" on="false"/>
                 <v:stroke color="#3465a4" joinstyle="round" endcap="flat"/>
                 <v:textbox>
                   <w:txbxContent>
                     <w:p>
                       <w:pPr>
-                        <w:pStyle w:val="Contedodoquadro"/>
+                        <w:pStyle w:val="Contedodoquadrouser"/>
                         <w:rPr/>
                       </w:pPr>
                       <w:r>
@@ -215,7 +217,7 @@
         <mc:AlternateContent>
           <mc:Choice Requires="wps">
             <w:drawing>
-              <wp:anchor behindDoc="0" distT="0" distB="1270" distL="0" distR="0" simplePos="0" locked="0" layoutInCell="1" allowOverlap="1" relativeHeight="6" wp14:anchorId="5321EB3C">
+              <wp:anchor distT="0" distB="1270" distL="0" distR="0" simplePos="0" relativeHeight="6" behindDoc="0" locked="0" layoutInCell="1" allowOverlap="1" wp14:anchorId="5321EB3C">
                 <wp:simplePos x="0" y="0"/>
                 <wp:positionH relativeFrom="column">
                   <wp:posOffset>3500120</wp:posOffset>
@@ -254,7 +256,7 @@
                         <w:txbxContent>
                           <w:p>
                             <w:pPr>
-                              <w:pStyle w:val="Contedodoquadro"/>
+                              <w:pStyle w:val="Contedodoquadrouser"/>
                               <w:rPr/>
                             </w:pPr>
                             <w:r>
@@ -276,14 +278,14 @@
           </mc:Choice>
           <mc:Fallback>
             <w:pict>
-              <v:rect id="shape_0" ID="Caixa de Texto 4" path="m0,0l-2147483645,0l-2147483645,-2147483646l0,-2147483646xe" stroked="f" o:allowincell="f" style="position:absolute;margin-left:275.6pt;margin-top:23.35pt;width:227.2pt;height:22.35pt;mso-wrap-style:square;v-text-anchor:top" wp14:anchorId="5321EB3C">
+              <v:rect id="shape_0" stroked="f" o:allowincell="f" style="position:absolute;margin-left:275.6pt;margin-top:23.35pt;width:227.2pt;height:22.35pt;mso-wrap-style:square;v-text-anchor:top" wp14:anchorId="5321EB3C">
                 <v:fill o:detectmouseclick="t" on="false"/>
                 <v:stroke color="#3465a4" joinstyle="round" endcap="flat"/>
                 <v:textbox>
                   <w:txbxContent>
                     <w:p>
                       <w:pPr>
-                        <w:pStyle w:val="Contedodoquadro"/>
+                        <w:pStyle w:val="Contedodoquadrouser"/>
                         <w:rPr/>
                       </w:pPr>
                       <w:r>
@@ -301,18 +303,642 @@
         <mc:AlternateContent>
           <mc:Choice Requires="wps">
             <w:drawing>
-              <wp:anchor behindDoc="0" distT="0" distB="1270" distL="0" distR="0" simplePos="0" locked="0" layoutInCell="1" allowOverlap="1" relativeHeight="8" wp14:anchorId="72133C8F">
+              <wp:anchor distT="0" distB="0" distL="0" distR="0" simplePos="0" relativeHeight="8" behindDoc="0" locked="0" layoutInCell="1" allowOverlap="1" wp14:anchorId="2B0229CB">
                 <wp:simplePos x="0" y="0"/>
                 <wp:positionH relativeFrom="column">
-                  <wp:posOffset>598805</wp:posOffset>
+                  <wp:posOffset>1729740</wp:posOffset>
                 </wp:positionH>
                 <wp:positionV relativeFrom="paragraph">
-                  <wp:posOffset>643890</wp:posOffset>
+                  <wp:posOffset>635635</wp:posOffset>
+                </wp:positionV>
+                <wp:extent cx="1414780" cy="310515"/>
+                <wp:effectExtent l="0" t="0" r="0" b="0"/>
+                <wp:wrapNone/>
+                <wp:docPr id="4" name="Caixa de Texto 6"/>
+                <a:graphic xmlns:a="http://schemas.openxmlformats.org/drawingml/2006/main">
+                  <a:graphicData uri="http://schemas.microsoft.com/office/word/2010/wordprocessingShape">
+                    <wps:wsp>
+                      <wps:cNvSpPr/>
+                      <wps:spPr>
+                        <a:xfrm>
+                          <a:off x="0" y="0"/>
+                          <a:ext cx="1414800" cy="310680"/>
+                        </a:xfrm>
+                        <a:prstGeom prst="rect">
+                          <a:avLst/>
+                        </a:prstGeom>
+                        <a:noFill/>
+                        <a:ln w="0">
+                          <a:noFill/>
+                        </a:ln>
+                      </wps:spPr>
+                      <wps:style>
+                        <a:lnRef idx="0"/>
+                        <a:fillRef idx="0"/>
+                        <a:effectRef idx="0"/>
+                        <a:fontRef idx="minor"/>
+                      </wps:style>
+                      <wps:txbx>
+                        <w:txbxContent>
+                          <w:p>
+                            <w:pPr>
+                              <w:pStyle w:val="Contedodoquadrouser"/>
+                              <w:rPr/>
+                            </w:pPr>
+                            <w:r>
+                              <w:rPr/>
+                              <w:t>${CPF}</w:t>
+                            </w:r>
+                          </w:p>
+                        </w:txbxContent>
+                      </wps:txbx>
+                      <wps:bodyPr anchor="t">
+                        <a:prstTxWarp prst="textNoShape"/>
+                        <a:noAutofit/>
+                      </wps:bodyPr>
+                    </wps:wsp>
+                  </a:graphicData>
+                </a:graphic>
+              </wp:anchor>
+            </w:drawing>
+          </mc:Choice>
+          <mc:Fallback>
+            <w:pict>
+              <v:rect id="shape_0" stroked="f" o:allowincell="f" style="position:absolute;margin-left:136.2pt;margin-top:50.05pt;width:111.35pt;height:24.4pt;mso-wrap-style:square;v-text-anchor:top" wp14:anchorId="2B0229CB">
+                <v:fill o:detectmouseclick="t" on="false"/>
+                <v:stroke color="#3465a4" joinstyle="round" endcap="flat"/>
+                <v:textbox>
+                  <w:txbxContent>
+                    <w:p>
+                      <w:pPr>
+                        <w:pStyle w:val="Contedodoquadrouser"/>
+                        <w:rPr/>
+                      </w:pPr>
+                      <w:r>
+                        <w:rPr/>
+                        <w:t>${CPF}</w:t>
+                      </w:r>
+                    </w:p>
+                  </w:txbxContent>
+                </v:textbox>
+                <w10:wrap type="none"/>
+              </v:rect>
+            </w:pict>
+          </mc:Fallback>
+        </mc:AlternateContent>
+        <mc:AlternateContent>
+          <mc:Choice Requires="wps">
+            <w:drawing>
+              <wp:anchor distT="0" distB="4445" distL="0" distR="0" simplePos="0" relativeHeight="10" behindDoc="0" locked="0" layoutInCell="1" allowOverlap="1" wp14:anchorId="5BB7462F">
+                <wp:simplePos x="0" y="0"/>
+                <wp:positionH relativeFrom="column">
+                  <wp:posOffset>549275</wp:posOffset>
+                </wp:positionH>
+                <wp:positionV relativeFrom="paragraph">
+                  <wp:posOffset>2405380</wp:posOffset>
+                </wp:positionV>
+                <wp:extent cx="1035050" cy="319405"/>
+                <wp:effectExtent l="0" t="0" r="0" b="5080"/>
+                <wp:wrapNone/>
+                <wp:docPr id="5" name="Caixa de Texto 7"/>
+                <a:graphic xmlns:a="http://schemas.openxmlformats.org/drawingml/2006/main">
+                  <a:graphicData uri="http://schemas.microsoft.com/office/word/2010/wordprocessingShape">
+                    <wps:wsp>
+                      <wps:cNvSpPr/>
+                      <wps:spPr>
+                        <a:xfrm>
+                          <a:off x="0" y="0"/>
+                          <a:ext cx="1035000" cy="319320"/>
+                        </a:xfrm>
+                        <a:prstGeom prst="rect">
+                          <a:avLst/>
+                        </a:prstGeom>
+                        <a:noFill/>
+                        <a:ln w="0">
+                          <a:noFill/>
+                        </a:ln>
+                      </wps:spPr>
+                      <wps:style>
+                        <a:lnRef idx="0"/>
+                        <a:fillRef idx="0"/>
+                        <a:effectRef idx="0"/>
+                        <a:fontRef idx="minor"/>
+                      </wps:style>
+                      <wps:txbx>
+                        <w:txbxContent>
+                          <w:p>
+                            <w:pPr>
+                              <w:pStyle w:val="Contedodoquadrouser"/>
+                              <w:rPr/>
+                            </w:pPr>
+                            <w:r>
+                              <w:rPr/>
+                              <w:t>${NUMBER}</w:t>
+                            </w:r>
+                          </w:p>
+                        </w:txbxContent>
+                      </wps:txbx>
+                      <wps:bodyPr anchor="t">
+                        <a:prstTxWarp prst="textNoShape"/>
+                        <a:noAutofit/>
+                      </wps:bodyPr>
+                    </wps:wsp>
+                  </a:graphicData>
+                </a:graphic>
+              </wp:anchor>
+            </w:drawing>
+          </mc:Choice>
+          <mc:Fallback>
+            <w:pict>
+              <v:rect id="shape_0" stroked="f" o:allowincell="f" style="position:absolute;margin-left:43.25pt;margin-top:189.4pt;width:81.45pt;height:25.1pt;mso-wrap-style:square;v-text-anchor:top" wp14:anchorId="5BB7462F">
+                <v:fill o:detectmouseclick="t" on="false"/>
+                <v:stroke color="#3465a4" joinstyle="round" endcap="flat"/>
+                <v:textbox>
+                  <w:txbxContent>
+                    <w:p>
+                      <w:pPr>
+                        <w:pStyle w:val="Contedodoquadrouser"/>
+                        <w:rPr/>
+                      </w:pPr>
+                      <w:r>
+                        <w:rPr/>
+                        <w:t>${NUMBER}</w:t>
+                      </w:r>
+                    </w:p>
+                  </w:txbxContent>
+                </v:textbox>
+                <w10:wrap type="none"/>
+              </v:rect>
+            </w:pict>
+          </mc:Fallback>
+        </mc:AlternateContent>
+        <mc:AlternateContent>
+          <mc:Choice Requires="wps">
+            <w:drawing>
+              <wp:anchor distT="0" distB="0" distL="0" distR="0" simplePos="0" relativeHeight="12" behindDoc="0" locked="0" layoutInCell="1" allowOverlap="1" wp14:anchorId="3E075AE0">
+                <wp:simplePos x="0" y="0"/>
+                <wp:positionH relativeFrom="column">
+                  <wp:posOffset>3143885</wp:posOffset>
+                </wp:positionH>
+                <wp:positionV relativeFrom="paragraph">
+                  <wp:posOffset>2754630</wp:posOffset>
+                </wp:positionV>
+                <wp:extent cx="1848485" cy="293370"/>
+                <wp:effectExtent l="0" t="0" r="0" b="0"/>
+                <wp:wrapNone/>
+                <wp:docPr id="6" name="Caixa de Texto 9"/>
+                <a:graphic xmlns:a="http://schemas.openxmlformats.org/drawingml/2006/main">
+                  <a:graphicData uri="http://schemas.microsoft.com/office/word/2010/wordprocessingShape">
+                    <wps:wsp>
+                      <wps:cNvSpPr/>
+                      <wps:spPr>
+                        <a:xfrm>
+                          <a:off x="0" y="0"/>
+                          <a:ext cx="1848600" cy="293400"/>
+                        </a:xfrm>
+                        <a:prstGeom prst="rect">
+                          <a:avLst/>
+                        </a:prstGeom>
+                        <a:noFill/>
+                        <a:ln w="0">
+                          <a:noFill/>
+                        </a:ln>
+                      </wps:spPr>
+                      <wps:style>
+                        <a:lnRef idx="0"/>
+                        <a:fillRef idx="0"/>
+                        <a:effectRef idx="0"/>
+                        <a:fontRef idx="minor"/>
+                      </wps:style>
+                      <wps:txbx>
+                        <w:txbxContent>
+                          <w:p>
+                            <w:pPr>
+                              <w:pStyle w:val="Contedodoquadrouser"/>
+                              <w:rPr/>
+                            </w:pPr>
+                            <w:r>
+                              <w:rPr/>
+                              <w:t>${CITY}</w:t>
+                            </w:r>
+                          </w:p>
+                        </w:txbxContent>
+                      </wps:txbx>
+                      <wps:bodyPr anchor="t">
+                        <a:prstTxWarp prst="textNoShape"/>
+                        <a:noAutofit/>
+                      </wps:bodyPr>
+                    </wps:wsp>
+                  </a:graphicData>
+                </a:graphic>
+              </wp:anchor>
+            </w:drawing>
+          </mc:Choice>
+          <mc:Fallback>
+            <w:pict>
+              <v:rect id="shape_0" stroked="f" o:allowincell="f" style="position:absolute;margin-left:247.55pt;margin-top:216.9pt;width:145.5pt;height:23.05pt;mso-wrap-style:square;v-text-anchor:top" wp14:anchorId="3E075AE0">
+                <v:fill o:detectmouseclick="t" on="false"/>
+                <v:stroke color="#3465a4" joinstyle="round" endcap="flat"/>
+                <v:textbox>
+                  <w:txbxContent>
+                    <w:p>
+                      <w:pPr>
+                        <w:pStyle w:val="Contedodoquadrouser"/>
+                        <w:rPr/>
+                      </w:pPr>
+                      <w:r>
+                        <w:rPr/>
+                        <w:t>${CITY}</w:t>
+                      </w:r>
+                    </w:p>
+                  </w:txbxContent>
+                </v:textbox>
+                <w10:wrap type="none"/>
+              </v:rect>
+            </w:pict>
+          </mc:Fallback>
+        </mc:AlternateContent>
+        <mc:AlternateContent>
+          <mc:Choice Requires="wps">
+            <w:drawing>
+              <wp:anchor distT="0" distB="0" distL="0" distR="0" simplePos="0" relativeHeight="14" behindDoc="0" locked="0" layoutInCell="1" allowOverlap="1" wp14:anchorId="2B51696E">
+                <wp:simplePos x="0" y="0"/>
+                <wp:positionH relativeFrom="column">
+                  <wp:posOffset>407035</wp:posOffset>
+                </wp:positionH>
+                <wp:positionV relativeFrom="paragraph">
+                  <wp:posOffset>2728595</wp:posOffset>
+                </wp:positionV>
+                <wp:extent cx="2180590" cy="326390"/>
+                <wp:effectExtent l="0" t="0" r="0" b="0"/>
+                <wp:wrapNone/>
+                <wp:docPr id="7" name="Caixa de Texto 8"/>
+                <a:graphic xmlns:a="http://schemas.openxmlformats.org/drawingml/2006/main">
+                  <a:graphicData uri="http://schemas.microsoft.com/office/word/2010/wordprocessingShape">
+                    <wps:wsp>
+                      <wps:cNvSpPr/>
+                      <wps:spPr>
+                        <a:xfrm>
+                          <a:off x="0" y="0"/>
+                          <a:ext cx="2180520" cy="326520"/>
+                        </a:xfrm>
+                        <a:prstGeom prst="rect">
+                          <a:avLst/>
+                        </a:prstGeom>
+                        <a:noFill/>
+                        <a:ln w="0">
+                          <a:noFill/>
+                        </a:ln>
+                      </wps:spPr>
+                      <wps:style>
+                        <a:lnRef idx="0"/>
+                        <a:fillRef idx="0"/>
+                        <a:effectRef idx="0"/>
+                        <a:fontRef idx="minor"/>
+                      </wps:style>
+                      <wps:txbx>
+                        <w:txbxContent>
+                          <w:p>
+                            <w:pPr>
+                              <w:pStyle w:val="Contedodoquadrouser"/>
+                              <w:rPr>
+                                <w:w w:val="75"/>
+                                <w:sz w:val="16"/>
+                              </w:rPr>
+                            </w:pPr>
+                            <w:r>
+                              <w:rPr>
+                                <w:w w:val="75"/>
+                              </w:rPr>
+                              <w:t>${NEIGHBORHOOD}</w:t>
+                            </w:r>
+                          </w:p>
+                        </w:txbxContent>
+                      </wps:txbx>
+                      <wps:bodyPr anchor="t">
+                        <a:prstTxWarp prst="textNoShape"/>
+                        <a:noAutofit/>
+                      </wps:bodyPr>
+                    </wps:wsp>
+                  </a:graphicData>
+                </a:graphic>
+              </wp:anchor>
+            </w:drawing>
+          </mc:Choice>
+          <mc:Fallback>
+            <w:pict>
+              <v:rect id="shape_0" stroked="f" o:allowincell="f" style="position:absolute;margin-left:32.05pt;margin-top:214.85pt;width:171.65pt;height:25.65pt;mso-wrap-style:square;v-text-anchor:top" wp14:anchorId="2B51696E">
+                <v:fill o:detectmouseclick="t" on="false"/>
+                <v:stroke color="#3465a4" joinstyle="round" endcap="flat"/>
+                <v:textbox>
+                  <w:txbxContent>
+                    <w:p>
+                      <w:pPr>
+                        <w:pStyle w:val="Contedodoquadrouser"/>
+                        <w:rPr>
+                          <w:w w:val="75"/>
+                          <w:sz w:val="16"/>
+                        </w:rPr>
+                      </w:pPr>
+                      <w:r>
+                        <w:rPr>
+                          <w:w w:val="75"/>
+                        </w:rPr>
+                        <w:t>${NEIGHBORHOOD}</w:t>
+                      </w:r>
+                    </w:p>
+                  </w:txbxContent>
+                </v:textbox>
+                <w10:wrap type="none"/>
+              </v:rect>
+            </w:pict>
+          </mc:Fallback>
+        </mc:AlternateContent>
+        <mc:AlternateContent>
+          <mc:Choice Requires="wps">
+            <w:drawing>
+              <wp:anchor distT="0" distB="0" distL="0" distR="0" simplePos="0" relativeHeight="24" behindDoc="0" locked="0" layoutInCell="1" allowOverlap="1" wp14:anchorId="7568324F">
+                <wp:simplePos x="0" y="0"/>
+                <wp:positionH relativeFrom="column">
+                  <wp:posOffset>546735</wp:posOffset>
+                </wp:positionH>
+                <wp:positionV relativeFrom="paragraph">
+                  <wp:posOffset>3103245</wp:posOffset>
+                </wp:positionV>
+                <wp:extent cx="1517650" cy="293370"/>
+                <wp:effectExtent l="0" t="0" r="0" b="0"/>
+                <wp:wrapNone/>
+                <wp:docPr id="8" name="Caixa de Texto 10"/>
+                <a:graphic xmlns:a="http://schemas.openxmlformats.org/drawingml/2006/main">
+                  <a:graphicData uri="http://schemas.microsoft.com/office/word/2010/wordprocessingShape">
+                    <wps:wsp>
+                      <wps:cNvSpPr/>
+                      <wps:spPr>
+                        <a:xfrm>
+                          <a:off x="0" y="0"/>
+                          <a:ext cx="1517760" cy="293400"/>
+                        </a:xfrm>
+                        <a:prstGeom prst="rect">
+                          <a:avLst/>
+                        </a:prstGeom>
+                        <a:noFill/>
+                        <a:ln w="0">
+                          <a:noFill/>
+                        </a:ln>
+                      </wps:spPr>
+                      <wps:style>
+                        <a:lnRef idx="0"/>
+                        <a:fillRef idx="0"/>
+                        <a:effectRef idx="0"/>
+                        <a:fontRef idx="minor"/>
+                      </wps:style>
+                      <wps:txbx>
+                        <w:txbxContent>
+                          <w:p>
+                            <w:pPr>
+                              <w:pStyle w:val="Contedodoquadrouser"/>
+                              <w:rPr/>
+                            </w:pPr>
+                            <w:r>
+                              <w:rPr/>
+                              <w:t>${STATE}</w:t>
+                            </w:r>
+                          </w:p>
+                        </w:txbxContent>
+                      </wps:txbx>
+                      <wps:bodyPr anchor="t">
+                        <a:prstTxWarp prst="textNoShape"/>
+                        <a:noAutofit/>
+                      </wps:bodyPr>
+                    </wps:wsp>
+                  </a:graphicData>
+                </a:graphic>
+              </wp:anchor>
+            </w:drawing>
+          </mc:Choice>
+          <mc:Fallback>
+            <w:pict>
+              <v:rect id="shape_0" stroked="f" o:allowincell="f" style="position:absolute;margin-left:43.05pt;margin-top:244.35pt;width:119.45pt;height:23.05pt;mso-wrap-style:square;v-text-anchor:top" wp14:anchorId="7568324F">
+                <v:fill o:detectmouseclick="t" on="false"/>
+                <v:stroke color="#3465a4" joinstyle="round" endcap="flat"/>
+                <v:textbox>
+                  <w:txbxContent>
+                    <w:p>
+                      <w:pPr>
+                        <w:pStyle w:val="Contedodoquadrouser"/>
+                        <w:rPr/>
+                      </w:pPr>
+                      <w:r>
+                        <w:rPr/>
+                        <w:t>${STATE}</w:t>
+                      </w:r>
+                    </w:p>
+                  </w:txbxContent>
+                </v:textbox>
+                <w10:wrap type="none"/>
+              </v:rect>
+            </w:pict>
+          </mc:Fallback>
+        </mc:AlternateContent>
+        <mc:AlternateContent>
+          <mc:Choice Requires="wps">
+            <w:drawing>
+              <wp:anchor distT="0" distB="0" distL="0" distR="0" simplePos="0" relativeHeight="26" behindDoc="0" locked="0" layoutInCell="1" allowOverlap="1" wp14:anchorId="78ABDB51">
+                <wp:simplePos x="0" y="0"/>
+                <wp:positionH relativeFrom="column">
+                  <wp:posOffset>2472690</wp:posOffset>
+                </wp:positionH>
+                <wp:positionV relativeFrom="paragraph">
+                  <wp:posOffset>3090545</wp:posOffset>
+                </wp:positionV>
+                <wp:extent cx="1405890" cy="293370"/>
+                <wp:effectExtent l="0" t="0" r="0" b="0"/>
+                <wp:wrapNone/>
+                <wp:docPr id="9" name="Caixa de Texto 11"/>
+                <a:graphic xmlns:a="http://schemas.openxmlformats.org/drawingml/2006/main">
+                  <a:graphicData uri="http://schemas.microsoft.com/office/word/2010/wordprocessingShape">
+                    <wps:wsp>
+                      <wps:cNvSpPr/>
+                      <wps:spPr>
+                        <a:xfrm>
+                          <a:off x="0" y="0"/>
+                          <a:ext cx="1405800" cy="293400"/>
+                        </a:xfrm>
+                        <a:prstGeom prst="rect">
+                          <a:avLst/>
+                        </a:prstGeom>
+                        <a:noFill/>
+                        <a:ln w="0">
+                          <a:noFill/>
+                        </a:ln>
+                      </wps:spPr>
+                      <wps:style>
+                        <a:lnRef idx="0"/>
+                        <a:fillRef idx="0"/>
+                        <a:effectRef idx="0"/>
+                        <a:fontRef idx="minor"/>
+                      </wps:style>
+                      <wps:txbx>
+                        <w:txbxContent>
+                          <w:p>
+                            <w:pPr>
+                              <w:pStyle w:val="Contedodoquadrouser"/>
+                              <w:rPr/>
+                            </w:pPr>
+                            <w:r>
+                              <w:rPr/>
+                              <w:t>${CEP}</w:t>
+                            </w:r>
+                          </w:p>
+                        </w:txbxContent>
+                      </wps:txbx>
+                      <wps:bodyPr anchor="t">
+                        <a:prstTxWarp prst="textNoShape"/>
+                        <a:noAutofit/>
+                      </wps:bodyPr>
+                    </wps:wsp>
+                  </a:graphicData>
+                </a:graphic>
+              </wp:anchor>
+            </w:drawing>
+          </mc:Choice>
+          <mc:Fallback>
+            <w:pict>
+              <v:rect id="shape_0" stroked="f" o:allowincell="f" style="position:absolute;margin-left:194.7pt;margin-top:243.35pt;width:110.65pt;height:23.05pt;mso-wrap-style:square;v-text-anchor:top" wp14:anchorId="78ABDB51">
+                <v:fill o:detectmouseclick="t" on="false"/>
+                <v:stroke color="#3465a4" joinstyle="round" endcap="flat"/>
+                <v:textbox>
+                  <w:txbxContent>
+                    <w:p>
+                      <w:pPr>
+                        <w:pStyle w:val="Contedodoquadrouser"/>
+                        <w:rPr/>
+                      </w:pPr>
+                      <w:r>
+                        <w:rPr/>
+                        <w:t>${CEP}</w:t>
+                      </w:r>
+                    </w:p>
+                  </w:txbxContent>
+                </v:textbox>
+                <w10:wrap type="none"/>
+              </v:rect>
+            </w:pict>
+          </mc:Fallback>
+        </mc:AlternateContent>
+        <mc:AlternateContent>
+          <mc:Choice Requires="wps">
+            <w:drawing>
+              <wp:anchor distT="0" distB="3175" distL="0" distR="0" simplePos="0" relativeHeight="28" behindDoc="0" locked="0" layoutInCell="1" allowOverlap="1" wp14:anchorId="492DB0C3">
+                <wp:simplePos x="0" y="0"/>
+                <wp:positionH relativeFrom="column">
+                  <wp:posOffset>20955</wp:posOffset>
+                </wp:positionH>
+                <wp:positionV relativeFrom="paragraph">
+                  <wp:posOffset>2050415</wp:posOffset>
+                </wp:positionV>
+                <wp:extent cx="3855720" cy="302260"/>
+                <wp:effectExtent l="0" t="0" r="0" b="3175"/>
+                <wp:wrapNone/>
+                <wp:docPr id="10" name="Caixa de Texto 16"/>
+                <a:graphic xmlns:a="http://schemas.openxmlformats.org/drawingml/2006/main">
+                  <a:graphicData uri="http://schemas.microsoft.com/office/word/2010/wordprocessingShape">
+                    <wps:wsp>
+                      <wps:cNvSpPr/>
+                      <wps:spPr>
+                        <a:xfrm>
+                          <a:off x="0" y="0"/>
+                          <a:ext cx="3855600" cy="302400"/>
+                        </a:xfrm>
+                        <a:prstGeom prst="rect">
+                          <a:avLst/>
+                        </a:prstGeom>
+                        <a:noFill/>
+                        <a:ln w="0">
+                          <a:noFill/>
+                        </a:ln>
+                      </wps:spPr>
+                      <wps:style>
+                        <a:lnRef idx="0"/>
+                        <a:fillRef idx="0"/>
+                        <a:effectRef idx="0"/>
+                        <a:fontRef idx="minor"/>
+                      </wps:style>
+                      <wps:txbx>
+                        <w:txbxContent>
+                          <w:p>
+                            <w:pPr>
+                              <w:pStyle w:val="Contedodoquadrouser"/>
+                              <w:rPr/>
+                            </w:pPr>
+                            <w:r>
+                              <w:rPr/>
+                              <w:t>${ADDRESS}</w:t>
+                            </w:r>
+                          </w:p>
+                        </w:txbxContent>
+                      </wps:txbx>
+                      <wps:bodyPr anchor="t">
+                        <a:prstTxWarp prst="textNoShape"/>
+                        <a:noAutofit/>
+                      </wps:bodyPr>
+                    </wps:wsp>
+                  </a:graphicData>
+                </a:graphic>
+              </wp:anchor>
+            </w:drawing>
+          </mc:Choice>
+          <mc:Fallback>
+            <w:pict>
+              <v:rect id="shape_0" stroked="f" o:allowincell="f" style="position:absolute;margin-left:1.65pt;margin-top:161.45pt;width:303.55pt;height:23.75pt;mso-wrap-style:square;v-text-anchor:top" wp14:anchorId="492DB0C3">
+                <v:fill o:detectmouseclick="t" on="false"/>
+                <v:stroke color="#3465a4" joinstyle="round" endcap="flat"/>
+                <v:textbox>
+                  <w:txbxContent>
+                    <w:p>
+                      <w:pPr>
+                        <w:pStyle w:val="Contedodoquadrouser"/>
+                        <w:rPr/>
+                      </w:pPr>
+                      <w:r>
+                        <w:rPr/>
+                        <w:t>${ADDRESS}</w:t>
+                      </w:r>
+                    </w:p>
+                  </w:txbxContent>
+                </v:textbox>
+                <w10:wrap type="none"/>
+              </v:rect>
+            </w:pict>
+          </mc:Fallback>
+        </mc:AlternateContent>
+      </w:r>
+      <w:r>
+        <w:rPr>
+          <w:b/>
+        </w:rPr>
+        <w:t>Eu</w:t>
+      </w:r>
+      <w:r>
+        <w:rPr/>
+        <w:t>, _______________________________________________________, de nacionalidade __________________________, RG ________________, órgão emissor ___</w:t>
+      </w:r>
+      <w:r>
+        <mc:AlternateContent>
+          <mc:Choice Requires="wps">
+            <w:drawing>
+              <wp:anchor distT="0" distB="1270" distL="0" distR="0" simplePos="0" relativeHeight="32" behindDoc="0" locked="0" layoutInCell="1" allowOverlap="1" wp14:anchorId="72133C8F">
+                <wp:simplePos x="0" y="0"/>
+                <wp:positionH relativeFrom="column">
+                  <wp:posOffset>481330</wp:posOffset>
+                </wp:positionH>
+                <wp:positionV relativeFrom="paragraph">
+                  <wp:posOffset>638175</wp:posOffset>
                 </wp:positionV>
                 <wp:extent cx="1035050" cy="284480"/>
                 <wp:effectExtent l="0" t="0" r="0" b="1270"/>
                 <wp:wrapNone/>
-                <wp:docPr id="4" name="Caixa de Texto 5"/>
+                <wp:docPr id="11" name="Caixa de Texto 3"/>
                 <a:graphic xmlns:a="http://schemas.openxmlformats.org/drawingml/2006/main">
                   <a:graphicData uri="http://schemas.microsoft.com/office/word/2010/wordprocessingShape">
                     <wps:wsp>
@@ -340,12 +966,20 @@
                         <w:txbxContent>
                           <w:p>
                             <w:pPr>
-                              <w:pStyle w:val="Contedodoquadro"/>
+                              <w:pStyle w:val="Contedodoquadrouser"/>
                               <w:rPr/>
                             </w:pPr>
                             <w:r>
                               <w:rPr/>
-                              <w:t>${RG_ISSUER}</w:t>
+                              <w:t>${</w:t>
+                            </w:r>
+                            <w:r>
+                              <w:rPr/>
+                              <w:t>RG_</w:t>
+                            </w:r>
+                            <w:r>
+                              <w:rPr/>
+                              <w:t>ISSUER}</w:t>
                             </w:r>
                           </w:p>
                         </w:txbxContent>
@@ -362,631 +996,27 @@
           </mc:Choice>
           <mc:Fallback>
             <w:pict>
-              <v:rect id="shape_0" ID="Caixa de Texto 5" path="m0,0l-2147483645,0l-2147483645,-2147483646l0,-2147483646xe" stroked="f" o:allowincell="f" style="position:absolute;margin-left:47.15pt;margin-top:50.7pt;width:81.45pt;height:22.35pt;mso-wrap-style:square;v-text-anchor:top" wp14:anchorId="72133C8F">
+              <v:rect id="shape_0" stroked="f" o:allowincell="f" style="position:absolute;margin-left:37.9pt;margin-top:50.25pt;width:81.45pt;height:22.35pt;mso-wrap-style:square;v-text-anchor:top" wp14:anchorId="72133C8F">
                 <v:fill o:detectmouseclick="t" on="false"/>
                 <v:stroke color="#3465a4" joinstyle="round" endcap="flat"/>
                 <v:textbox>
                   <w:txbxContent>
                     <w:p>
                       <w:pPr>
-                        <w:pStyle w:val="Contedodoquadro"/>
+                        <w:pStyle w:val="Contedodoquadrouser"/>
                         <w:rPr/>
                       </w:pPr>
                       <w:r>
                         <w:rPr/>
-                        <w:t>${RG_ISSUER}</w:t>
+                        <w:t>${</w:t>
                       </w:r>
-                    </w:p>
-                  </w:txbxContent>
-                </v:textbox>
-                <w10:wrap type="none"/>
-              </v:rect>
-            </w:pict>
-          </mc:Fallback>
-        </mc:AlternateContent>
-        <mc:AlternateContent>
-          <mc:Choice Requires="wps">
-            <w:drawing>
-              <wp:anchor behindDoc="0" distT="0" distB="0" distL="0" distR="0" simplePos="0" locked="0" layoutInCell="1" allowOverlap="1" relativeHeight="10" wp14:anchorId="2B0229CB">
-                <wp:simplePos x="0" y="0"/>
-                <wp:positionH relativeFrom="column">
-                  <wp:posOffset>1729740</wp:posOffset>
-                </wp:positionH>
-                <wp:positionV relativeFrom="paragraph">
-                  <wp:posOffset>635635</wp:posOffset>
-                </wp:positionV>
-                <wp:extent cx="1414780" cy="310515"/>
-                <wp:effectExtent l="0" t="0" r="0" b="0"/>
-                <wp:wrapNone/>
-                <wp:docPr id="5" name="Caixa de Texto 6"/>
-                <a:graphic xmlns:a="http://schemas.openxmlformats.org/drawingml/2006/main">
-                  <a:graphicData uri="http://schemas.microsoft.com/office/word/2010/wordprocessingShape">
-                    <wps:wsp>
-                      <wps:cNvSpPr/>
-                      <wps:spPr>
-                        <a:xfrm>
-                          <a:off x="0" y="0"/>
-                          <a:ext cx="1414800" cy="310680"/>
-                        </a:xfrm>
-                        <a:prstGeom prst="rect">
-                          <a:avLst/>
-                        </a:prstGeom>
-                        <a:noFill/>
-                        <a:ln w="0">
-                          <a:noFill/>
-                        </a:ln>
-                      </wps:spPr>
-                      <wps:style>
-                        <a:lnRef idx="0"/>
-                        <a:fillRef idx="0"/>
-                        <a:effectRef idx="0"/>
-                        <a:fontRef idx="minor"/>
-                      </wps:style>
-                      <wps:txbx>
-                        <w:txbxContent>
-                          <w:p>
-                            <w:pPr>
-                              <w:pStyle w:val="Contedodoquadro"/>
-                              <w:rPr/>
-                            </w:pPr>
-                            <w:r>
-                              <w:rPr/>
-                              <w:t>${CPF}</w:t>
-                            </w:r>
-                          </w:p>
-                        </w:txbxContent>
-                      </wps:txbx>
-                      <wps:bodyPr anchor="t">
-                        <a:prstTxWarp prst="textNoShape"/>
-                        <a:noAutofit/>
-                      </wps:bodyPr>
-                    </wps:wsp>
-                  </a:graphicData>
-                </a:graphic>
-              </wp:anchor>
-            </w:drawing>
-          </mc:Choice>
-          <mc:Fallback>
-            <w:pict>
-              <v:rect id="shape_0" ID="Caixa de Texto 6" path="m0,0l-2147483645,0l-2147483645,-2147483646l0,-2147483646xe" stroked="f" o:allowincell="f" style="position:absolute;margin-left:136.2pt;margin-top:50.05pt;width:111.35pt;height:24.4pt;mso-wrap-style:square;v-text-anchor:top" wp14:anchorId="2B0229CB">
-                <v:fill o:detectmouseclick="t" on="false"/>
-                <v:stroke color="#3465a4" joinstyle="round" endcap="flat"/>
-                <v:textbox>
-                  <w:txbxContent>
-                    <w:p>
-                      <w:pPr>
-                        <w:pStyle w:val="Contedodoquadro"/>
-                        <w:rPr/>
-                      </w:pPr>
                       <w:r>
                         <w:rPr/>
-                        <w:t>${CPF}</w:t>
+                        <w:t>RG_</w:t>
                       </w:r>
-                    </w:p>
-                  </w:txbxContent>
-                </v:textbox>
-                <w10:wrap type="none"/>
-              </v:rect>
-            </w:pict>
-          </mc:Fallback>
-        </mc:AlternateContent>
-        <mc:AlternateContent>
-          <mc:Choice Requires="wps">
-            <w:drawing>
-              <wp:anchor behindDoc="0" distT="0" distB="4445" distL="0" distR="0" simplePos="0" locked="0" layoutInCell="1" allowOverlap="1" relativeHeight="12" wp14:anchorId="5BB7462F">
-                <wp:simplePos x="0" y="0"/>
-                <wp:positionH relativeFrom="column">
-                  <wp:posOffset>549275</wp:posOffset>
-                </wp:positionH>
-                <wp:positionV relativeFrom="paragraph">
-                  <wp:posOffset>2405380</wp:posOffset>
-                </wp:positionV>
-                <wp:extent cx="1035050" cy="319405"/>
-                <wp:effectExtent l="0" t="0" r="0" b="5080"/>
-                <wp:wrapNone/>
-                <wp:docPr id="6" name="Caixa de Texto 7"/>
-                <a:graphic xmlns:a="http://schemas.openxmlformats.org/drawingml/2006/main">
-                  <a:graphicData uri="http://schemas.microsoft.com/office/word/2010/wordprocessingShape">
-                    <wps:wsp>
-                      <wps:cNvSpPr/>
-                      <wps:spPr>
-                        <a:xfrm>
-                          <a:off x="0" y="0"/>
-                          <a:ext cx="1035000" cy="319320"/>
-                        </a:xfrm>
-                        <a:prstGeom prst="rect">
-                          <a:avLst/>
-                        </a:prstGeom>
-                        <a:noFill/>
-                        <a:ln w="0">
-                          <a:noFill/>
-                        </a:ln>
-                      </wps:spPr>
-                      <wps:style>
-                        <a:lnRef idx="0"/>
-                        <a:fillRef idx="0"/>
-                        <a:effectRef idx="0"/>
-                        <a:fontRef idx="minor"/>
-                      </wps:style>
-                      <wps:txbx>
-                        <w:txbxContent>
-                          <w:p>
-                            <w:pPr>
-                              <w:pStyle w:val="Contedodoquadro"/>
-                              <w:rPr/>
-                            </w:pPr>
-                            <w:r>
-                              <w:rPr/>
-                              <w:t>${NUMBER}</w:t>
-                            </w:r>
-                          </w:p>
-                        </w:txbxContent>
-                      </wps:txbx>
-                      <wps:bodyPr anchor="t">
-                        <a:prstTxWarp prst="textNoShape"/>
-                        <a:noAutofit/>
-                      </wps:bodyPr>
-                    </wps:wsp>
-                  </a:graphicData>
-                </a:graphic>
-              </wp:anchor>
-            </w:drawing>
-          </mc:Choice>
-          <mc:Fallback>
-            <w:pict>
-              <v:rect id="shape_0" ID="Caixa de Texto 7" path="m0,0l-2147483645,0l-2147483645,-2147483646l0,-2147483646xe" stroked="f" o:allowincell="f" style="position:absolute;margin-left:43.25pt;margin-top:189.4pt;width:81.45pt;height:25.1pt;mso-wrap-style:square;v-text-anchor:top" wp14:anchorId="5BB7462F">
-                <v:fill o:detectmouseclick="t" on="false"/>
-                <v:stroke color="#3465a4" joinstyle="round" endcap="flat"/>
-                <v:textbox>
-                  <w:txbxContent>
-                    <w:p>
-                      <w:pPr>
-                        <w:pStyle w:val="Contedodoquadro"/>
-                        <w:rPr/>
-                      </w:pPr>
                       <w:r>
                         <w:rPr/>
-                        <w:t>${NUMBER}</w:t>
-                      </w:r>
-                    </w:p>
-                  </w:txbxContent>
-                </v:textbox>
-                <w10:wrap type="none"/>
-              </v:rect>
-            </w:pict>
-          </mc:Fallback>
-        </mc:AlternateContent>
-        <mc:AlternateContent>
-          <mc:Choice Requires="wps">
-            <w:drawing>
-              <wp:anchor behindDoc="0" distT="0" distB="0" distL="0" distR="0" simplePos="0" locked="0" layoutInCell="1" allowOverlap="1" relativeHeight="14" wp14:anchorId="2B51696E">
-                <wp:simplePos x="0" y="0"/>
-                <wp:positionH relativeFrom="column">
-                  <wp:posOffset>324485</wp:posOffset>
-                </wp:positionH>
-                <wp:positionV relativeFrom="paragraph">
-                  <wp:posOffset>2767330</wp:posOffset>
-                </wp:positionV>
-                <wp:extent cx="2673985" cy="326390"/>
-                <wp:effectExtent l="0" t="0" r="0" b="0"/>
-                <wp:wrapNone/>
-                <wp:docPr id="7" name="Caixa de Texto 8"/>
-                <a:graphic xmlns:a="http://schemas.openxmlformats.org/drawingml/2006/main">
-                  <a:graphicData uri="http://schemas.microsoft.com/office/word/2010/wordprocessingShape">
-                    <wps:wsp>
-                      <wps:cNvSpPr/>
-                      <wps:spPr>
-                        <a:xfrm>
-                          <a:off x="0" y="0"/>
-                          <a:ext cx="2674080" cy="326520"/>
-                        </a:xfrm>
-                        <a:prstGeom prst="rect">
-                          <a:avLst/>
-                        </a:prstGeom>
-                        <a:noFill/>
-                        <a:ln w="0">
-                          <a:noFill/>
-                        </a:ln>
-                      </wps:spPr>
-                      <wps:style>
-                        <a:lnRef idx="0"/>
-                        <a:fillRef idx="0"/>
-                        <a:effectRef idx="0"/>
-                        <a:fontRef idx="minor"/>
-                      </wps:style>
-                      <wps:txbx>
-                        <w:txbxContent>
-                          <w:p>
-                            <w:pPr>
-                              <w:pStyle w:val="Contedodoquadro"/>
-                              <w:rPr>
-                                <w:w w:val="75"/>
-                                <w:sz w:val="16"/>
-                              </w:rPr>
-                            </w:pPr>
-                            <w:r>
-                              <w:rPr>
-                                <w:w w:val="75"/>
-                              </w:rPr>
-                              <w:t>${NEIGHBORHOOD}</w:t>
-                            </w:r>
-                          </w:p>
-                        </w:txbxContent>
-                      </wps:txbx>
-                      <wps:bodyPr anchor="t">
-                        <a:prstTxWarp prst="textNoShape"/>
-                        <a:noAutofit/>
-                      </wps:bodyPr>
-                    </wps:wsp>
-                  </a:graphicData>
-                </a:graphic>
-              </wp:anchor>
-            </w:drawing>
-          </mc:Choice>
-          <mc:Fallback>
-            <w:pict>
-              <v:rect id="shape_0" ID="Caixa de Texto 8" path="m0,0l-2147483645,0l-2147483645,-2147483646l0,-2147483646xe" stroked="f" o:allowincell="f" style="position:absolute;margin-left:25.55pt;margin-top:217.9pt;width:210.5pt;height:25.65pt;mso-wrap-style:square;v-text-anchor:top" wp14:anchorId="2B51696E">
-                <v:fill o:detectmouseclick="t" on="false"/>
-                <v:stroke color="#3465a4" joinstyle="round" endcap="flat"/>
-                <v:textbox>
-                  <w:txbxContent>
-                    <w:p>
-                      <w:pPr>
-                        <w:pStyle w:val="Contedodoquadro"/>
-                        <w:rPr>
-                          <w:w w:val="75"/>
-                          <w:sz w:val="16"/>
-                        </w:rPr>
-                      </w:pPr>
-                      <w:r>
-                        <w:rPr>
-                          <w:w w:val="75"/>
-                        </w:rPr>
-                        <w:t>${NEIGHBORHOOD}</w:t>
-                      </w:r>
-                    </w:p>
-                  </w:txbxContent>
-                </v:textbox>
-                <w10:wrap type="none"/>
-              </v:rect>
-            </w:pict>
-          </mc:Fallback>
-        </mc:AlternateContent>
-        <mc:AlternateContent>
-          <mc:Choice Requires="wps">
-            <w:drawing>
-              <wp:anchor behindDoc="0" distT="0" distB="0" distL="0" distR="0" simplePos="0" locked="0" layoutInCell="1" allowOverlap="1" relativeHeight="16" wp14:anchorId="3E075AE0">
-                <wp:simplePos x="0" y="0"/>
-                <wp:positionH relativeFrom="column">
-                  <wp:posOffset>2782570</wp:posOffset>
-                </wp:positionH>
-                <wp:positionV relativeFrom="paragraph">
-                  <wp:posOffset>2767330</wp:posOffset>
-                </wp:positionV>
-                <wp:extent cx="2406650" cy="293370"/>
-                <wp:effectExtent l="0" t="0" r="0" b="0"/>
-                <wp:wrapNone/>
-                <wp:docPr id="8" name="Caixa de Texto 9"/>
-                <a:graphic xmlns:a="http://schemas.openxmlformats.org/drawingml/2006/main">
-                  <a:graphicData uri="http://schemas.microsoft.com/office/word/2010/wordprocessingShape">
-                    <wps:wsp>
-                      <wps:cNvSpPr/>
-                      <wps:spPr>
-                        <a:xfrm>
-                          <a:off x="0" y="0"/>
-                          <a:ext cx="2406600" cy="293400"/>
-                        </a:xfrm>
-                        <a:prstGeom prst="rect">
-                          <a:avLst/>
-                        </a:prstGeom>
-                        <a:noFill/>
-                        <a:ln w="0">
-                          <a:noFill/>
-                        </a:ln>
-                      </wps:spPr>
-                      <wps:style>
-                        <a:lnRef idx="0"/>
-                        <a:fillRef idx="0"/>
-                        <a:effectRef idx="0"/>
-                        <a:fontRef idx="minor"/>
-                      </wps:style>
-                      <wps:txbx>
-                        <w:txbxContent>
-                          <w:p>
-                            <w:pPr>
-                              <w:pStyle w:val="Contedodoquadro"/>
-                              <w:rPr/>
-                            </w:pPr>
-                            <w:r>
-                              <w:rPr/>
-                              <w:t>${CITY}</w:t>
-                            </w:r>
-                          </w:p>
-                        </w:txbxContent>
-                      </wps:txbx>
-                      <wps:bodyPr anchor="t">
-                        <a:prstTxWarp prst="textNoShape"/>
-                        <a:noAutofit/>
-                      </wps:bodyPr>
-                    </wps:wsp>
-                  </a:graphicData>
-                </a:graphic>
-              </wp:anchor>
-            </w:drawing>
-          </mc:Choice>
-          <mc:Fallback>
-            <w:pict>
-              <v:rect id="shape_0" ID="Caixa de Texto 9" path="m0,0l-2147483645,0l-2147483645,-2147483646l0,-2147483646xe" stroked="f" o:allowincell="f" style="position:absolute;margin-left:219.1pt;margin-top:217.9pt;width:189.45pt;height:23.05pt;mso-wrap-style:square;v-text-anchor:top" wp14:anchorId="3E075AE0">
-                <v:fill o:detectmouseclick="t" on="false"/>
-                <v:stroke color="#3465a4" joinstyle="round" endcap="flat"/>
-                <v:textbox>
-                  <w:txbxContent>
-                    <w:p>
-                      <w:pPr>
-                        <w:pStyle w:val="Contedodoquadro"/>
-                        <w:rPr/>
-                      </w:pPr>
-                      <w:r>
-                        <w:rPr/>
-                        <w:t>${CITY}</w:t>
-                      </w:r>
-                    </w:p>
-                  </w:txbxContent>
-                </v:textbox>
-                <w10:wrap type="none"/>
-              </v:rect>
-            </w:pict>
-          </mc:Fallback>
-        </mc:AlternateContent>
-        <mc:AlternateContent>
-          <mc:Choice Requires="wps">
-            <w:drawing>
-              <wp:anchor behindDoc="0" distT="0" distB="0" distL="0" distR="0" simplePos="0" locked="0" layoutInCell="1" allowOverlap="1" relativeHeight="18" wp14:anchorId="7568324F">
-                <wp:simplePos x="0" y="0"/>
-                <wp:positionH relativeFrom="column">
-                  <wp:posOffset>556895</wp:posOffset>
-                </wp:positionH>
-                <wp:positionV relativeFrom="paragraph">
-                  <wp:posOffset>3103245</wp:posOffset>
-                </wp:positionV>
-                <wp:extent cx="1517650" cy="293370"/>
-                <wp:effectExtent l="0" t="0" r="0" b="0"/>
-                <wp:wrapNone/>
-                <wp:docPr id="9" name="Caixa de Texto 10"/>
-                <a:graphic xmlns:a="http://schemas.openxmlformats.org/drawingml/2006/main">
-                  <a:graphicData uri="http://schemas.microsoft.com/office/word/2010/wordprocessingShape">
-                    <wps:wsp>
-                      <wps:cNvSpPr/>
-                      <wps:spPr>
-                        <a:xfrm>
-                          <a:off x="0" y="0"/>
-                          <a:ext cx="1517760" cy="293400"/>
-                        </a:xfrm>
-                        <a:prstGeom prst="rect">
-                          <a:avLst/>
-                        </a:prstGeom>
-                        <a:noFill/>
-                        <a:ln w="0">
-                          <a:noFill/>
-                        </a:ln>
-                      </wps:spPr>
-                      <wps:style>
-                        <a:lnRef idx="0"/>
-                        <a:fillRef idx="0"/>
-                        <a:effectRef idx="0"/>
-                        <a:fontRef idx="minor"/>
-                      </wps:style>
-                      <wps:txbx>
-                        <w:txbxContent>
-                          <w:p>
-                            <w:pPr>
-                              <w:pStyle w:val="Contedodoquadro"/>
-                              <w:rPr/>
-                            </w:pPr>
-                            <w:r>
-                              <w:rPr/>
-                              <w:t>${STATE}</w:t>
-                            </w:r>
-                          </w:p>
-                        </w:txbxContent>
-                      </wps:txbx>
-                      <wps:bodyPr anchor="t">
-                        <a:prstTxWarp prst="textNoShape"/>
-                        <a:noAutofit/>
-                      </wps:bodyPr>
-                    </wps:wsp>
-                  </a:graphicData>
-                </a:graphic>
-              </wp:anchor>
-            </w:drawing>
-          </mc:Choice>
-          <mc:Fallback>
-            <w:pict>
-              <v:rect id="shape_0" ID="Caixa de Texto 10" path="m0,0l-2147483645,0l-2147483645,-2147483646l0,-2147483646xe" stroked="f" o:allowincell="f" style="position:absolute;margin-left:43.85pt;margin-top:244.35pt;width:119.45pt;height:23.05pt;mso-wrap-style:square;v-text-anchor:top" wp14:anchorId="7568324F">
-                <v:fill o:detectmouseclick="t" on="false"/>
-                <v:stroke color="#3465a4" joinstyle="round" endcap="flat"/>
-                <v:textbox>
-                  <w:txbxContent>
-                    <w:p>
-                      <w:pPr>
-                        <w:pStyle w:val="Contedodoquadro"/>
-                        <w:rPr/>
-                      </w:pPr>
-                      <w:r>
-                        <w:rPr/>
-                        <w:t>${STATE}</w:t>
-                      </w:r>
-                    </w:p>
-                  </w:txbxContent>
-                </v:textbox>
-                <w10:wrap type="none"/>
-              </v:rect>
-            </w:pict>
-          </mc:Fallback>
-        </mc:AlternateContent>
-        <mc:AlternateContent>
-          <mc:Choice Requires="wps">
-            <w:drawing>
-              <wp:anchor behindDoc="0" distT="0" distB="0" distL="0" distR="0" simplePos="0" locked="0" layoutInCell="1" allowOverlap="1" relativeHeight="20" wp14:anchorId="78ABDB51">
-                <wp:simplePos x="0" y="0"/>
-                <wp:positionH relativeFrom="column">
-                  <wp:posOffset>2403475</wp:posOffset>
-                </wp:positionH>
-                <wp:positionV relativeFrom="paragraph">
-                  <wp:posOffset>3112135</wp:posOffset>
-                </wp:positionV>
-                <wp:extent cx="1405890" cy="293370"/>
-                <wp:effectExtent l="0" t="0" r="0" b="0"/>
-                <wp:wrapNone/>
-                <wp:docPr id="10" name="Caixa de Texto 11"/>
-                <a:graphic xmlns:a="http://schemas.openxmlformats.org/drawingml/2006/main">
-                  <a:graphicData uri="http://schemas.microsoft.com/office/word/2010/wordprocessingShape">
-                    <wps:wsp>
-                      <wps:cNvSpPr/>
-                      <wps:spPr>
-                        <a:xfrm>
-                          <a:off x="0" y="0"/>
-                          <a:ext cx="1405800" cy="293400"/>
-                        </a:xfrm>
-                        <a:prstGeom prst="rect">
-                          <a:avLst/>
-                        </a:prstGeom>
-                        <a:noFill/>
-                        <a:ln w="0">
-                          <a:noFill/>
-                        </a:ln>
-                      </wps:spPr>
-                      <wps:style>
-                        <a:lnRef idx="0"/>
-                        <a:fillRef idx="0"/>
-                        <a:effectRef idx="0"/>
-                        <a:fontRef idx="minor"/>
-                      </wps:style>
-                      <wps:txbx>
-                        <w:txbxContent>
-                          <w:p>
-                            <w:pPr>
-                              <w:pStyle w:val="Contedodoquadro"/>
-                              <w:rPr/>
-                            </w:pPr>
-                            <w:r>
-                              <w:rPr/>
-                              <w:t>${CEP}</w:t>
-                            </w:r>
-                          </w:p>
-                        </w:txbxContent>
-                      </wps:txbx>
-                      <wps:bodyPr anchor="t">
-                        <a:prstTxWarp prst="textNoShape"/>
-                        <a:noAutofit/>
-                      </wps:bodyPr>
-                    </wps:wsp>
-                  </a:graphicData>
-                </a:graphic>
-              </wp:anchor>
-            </w:drawing>
-          </mc:Choice>
-          <mc:Fallback>
-            <w:pict>
-              <v:rect id="shape_0" ID="Caixa de Texto 11" path="m0,0l-2147483645,0l-2147483645,-2147483646l0,-2147483646xe" stroked="f" o:allowincell="f" style="position:absolute;margin-left:189.25pt;margin-top:245.05pt;width:110.65pt;height:23.05pt;mso-wrap-style:square;v-text-anchor:top" wp14:anchorId="78ABDB51">
-                <v:fill o:detectmouseclick="t" on="false"/>
-                <v:stroke color="#3465a4" joinstyle="round" endcap="flat"/>
-                <v:textbox>
-                  <w:txbxContent>
-                    <w:p>
-                      <w:pPr>
-                        <w:pStyle w:val="Contedodoquadro"/>
-                        <w:rPr/>
-                      </w:pPr>
-                      <w:r>
-                        <w:rPr/>
-                        <w:t>${CEP}</w:t>
-                      </w:r>
-                    </w:p>
-                  </w:txbxContent>
-                </v:textbox>
-                <w10:wrap type="none"/>
-              </v:rect>
-            </w:pict>
-          </mc:Fallback>
-        </mc:AlternateContent>
-        <mc:AlternateContent>
-          <mc:Choice Requires="wps">
-            <w:drawing>
-              <wp:anchor behindDoc="0" distT="0" distB="3175" distL="0" distR="0" simplePos="0" locked="0" layoutInCell="1" allowOverlap="1" relativeHeight="30" wp14:anchorId="492DB0C3">
-                <wp:simplePos x="0" y="0"/>
-                <wp:positionH relativeFrom="column">
-                  <wp:posOffset>20955</wp:posOffset>
-                </wp:positionH>
-                <wp:positionV relativeFrom="paragraph">
-                  <wp:posOffset>2050415</wp:posOffset>
-                </wp:positionV>
-                <wp:extent cx="3855720" cy="302260"/>
-                <wp:effectExtent l="0" t="0" r="0" b="3175"/>
-                <wp:wrapNone/>
-                <wp:docPr id="11" name="Caixa de Texto 16"/>
-                <a:graphic xmlns:a="http://schemas.openxmlformats.org/drawingml/2006/main">
-                  <a:graphicData uri="http://schemas.microsoft.com/office/word/2010/wordprocessingShape">
-                    <wps:wsp>
-                      <wps:cNvSpPr/>
-                      <wps:spPr>
-                        <a:xfrm>
-                          <a:off x="0" y="0"/>
-                          <a:ext cx="3855600" cy="302400"/>
-                        </a:xfrm>
-                        <a:prstGeom prst="rect">
-                          <a:avLst/>
-                        </a:prstGeom>
-                        <a:noFill/>
-                        <a:ln w="0">
-                          <a:noFill/>
-                        </a:ln>
-                      </wps:spPr>
-                      <wps:style>
-                        <a:lnRef idx="0"/>
-                        <a:fillRef idx="0"/>
-                        <a:effectRef idx="0"/>
-                        <a:fontRef idx="minor"/>
-                      </wps:style>
-                      <wps:txbx>
-                        <w:txbxContent>
-                          <w:p>
-                            <w:pPr>
-                              <w:pStyle w:val="Contedodoquadro"/>
-                              <w:rPr/>
-                            </w:pPr>
-                            <w:r>
-                              <w:rPr/>
-                              <w:t>${ADDRESS}</w:t>
-                            </w:r>
-                          </w:p>
-                        </w:txbxContent>
-                      </wps:txbx>
-                      <wps:bodyPr anchor="t">
-                        <a:prstTxWarp prst="textNoShape"/>
-                        <a:noAutofit/>
-                      </wps:bodyPr>
-                    </wps:wsp>
-                  </a:graphicData>
-                </a:graphic>
-              </wp:anchor>
-            </w:drawing>
-          </mc:Choice>
-          <mc:Fallback>
-            <w:pict>
-              <v:rect id="shape_0" ID="Caixa de Texto 16" path="m0,0l-2147483645,0l-2147483645,-2147483646l0,-2147483646xe" stroked="f" o:allowincell="f" style="position:absolute;margin-left:1.65pt;margin-top:161.45pt;width:303.55pt;height:23.75pt;mso-wrap-style:square;v-text-anchor:top" wp14:anchorId="492DB0C3">
-                <v:fill o:detectmouseclick="t" on="false"/>
-                <v:stroke color="#3465a4" joinstyle="round" endcap="flat"/>
-                <v:textbox>
-                  <w:txbxContent>
-                    <w:p>
-                      <w:pPr>
-                        <w:pStyle w:val="Contedodoquadro"/>
-                        <w:rPr/>
-                      </w:pPr>
-                      <w:r>
-                        <w:rPr/>
-                        <w:t>${ADDRESS}</w:t>
+                        <w:t>ISSUER}</w:t>
                       </w:r>
                     </w:p>
                   </w:txbxContent>
@@ -998,14 +1028,8 @@
         </mc:AlternateContent>
       </w:r>
       <w:r>
-        <w:rPr>
-          <w:b/>
-        </w:rPr>
-        <w:t>Eu</w:t>
-      </w:r>
-      <w:r>
         <w:rPr/>
-        <w:t xml:space="preserve">, _______________________________________________________, de nacionalidade __________________________, RG ________________, órgão emissor _______, CPF __________________, </w:t>
+        <w:t xml:space="preserve">____, CPF __________________, </w:t>
       </w:r>
       <w:r>
         <w:rPr>
@@ -1042,17 +1066,14 @@
       <w:pPr>
         <w:pStyle w:val="Normal"/>
         <w:spacing w:lineRule="auto" w:line="259" w:before="0" w:after="389"/>
-        <w:jc w:val="left"/>
-        <w:rPr>
-          <w:b/>
-          <w:bCs/>
-        </w:rPr>
+        <w:jc w:val="start"/>
+        <w:rPr/>
       </w:pPr>
       <w:r>
         <mc:AlternateContent>
           <mc:Choice Requires="wps">
             <w:drawing>
-              <wp:anchor behindDoc="0" distT="0" distB="5080" distL="0" distR="0" simplePos="0" locked="0" layoutInCell="1" allowOverlap="1" relativeHeight="22" wp14:anchorId="1F4E45FE">
+              <wp:anchor distT="0" distB="5080" distL="0" distR="0" simplePos="0" relativeHeight="16" behindDoc="0" locked="0" layoutInCell="1" allowOverlap="1" wp14:anchorId="1F4E45FE">
                 <wp:simplePos x="0" y="0"/>
                 <wp:positionH relativeFrom="column">
                   <wp:posOffset>307340</wp:posOffset>
@@ -1091,7 +1112,7 @@
                         <w:txbxContent>
                           <w:p>
                             <w:pPr>
-                              <w:pStyle w:val="Contedodoquadro"/>
+                              <w:pStyle w:val="Contedodoquadrouser"/>
                               <w:rPr/>
                             </w:pPr>
                             <w:r>
@@ -1113,14 +1134,14 @@
           </mc:Choice>
           <mc:Fallback>
             <w:pict>
-              <v:rect id="shape_0" ID="Caixa de Texto 12" path="m0,0l-2147483645,0l-2147483645,-2147483646l0,-2147483646xe" stroked="f" o:allowincell="f" style="position:absolute;margin-left:24.2pt;margin-top:29.9pt;width:128.35pt;height:32.55pt;mso-wrap-style:square;v-text-anchor:top" wp14:anchorId="1F4E45FE">
+              <v:rect id="shape_0" stroked="f" o:allowincell="f" style="position:absolute;margin-left:24.2pt;margin-top:29.9pt;width:128.35pt;height:32.55pt;mso-wrap-style:square;v-text-anchor:top" wp14:anchorId="1F4E45FE">
                 <v:fill o:detectmouseclick="t" on="false"/>
                 <v:stroke color="#3465a4" joinstyle="round" endcap="flat"/>
                 <v:textbox>
                   <w:txbxContent>
                     <w:p>
                       <w:pPr>
-                        <w:pStyle w:val="Contedodoquadro"/>
+                        <w:pStyle w:val="Contedodoquadrouser"/>
                         <w:rPr/>
                       </w:pPr>
                       <w:r>
@@ -1138,7 +1159,7 @@
         <mc:AlternateContent>
           <mc:Choice Requires="wps">
             <w:drawing>
-              <wp:anchor behindDoc="0" distT="0" distB="0" distL="0" distR="0" simplePos="0" locked="0" layoutInCell="1" allowOverlap="1" relativeHeight="24" wp14:anchorId="55E8B8D8">
+              <wp:anchor distT="0" distB="0" distL="0" distR="0" simplePos="0" relativeHeight="18" behindDoc="0" locked="0" layoutInCell="1" allowOverlap="1" wp14:anchorId="55E8B8D8">
                 <wp:simplePos x="0" y="0"/>
                 <wp:positionH relativeFrom="column">
                   <wp:posOffset>2005330</wp:posOffset>
@@ -1177,7 +1198,7 @@
                         <w:txbxContent>
                           <w:p>
                             <w:pPr>
-                              <w:pStyle w:val="Contedodoquadro"/>
+                              <w:pStyle w:val="Contedodoquadrouser"/>
                               <w:rPr/>
                             </w:pPr>
                             <w:r>
@@ -1199,14 +1220,14 @@
           </mc:Choice>
           <mc:Fallback>
             <w:pict>
-              <v:rect id="shape_0" ID="Caixa de Texto 13" path="m0,0l-2147483645,0l-2147483645,-2147483646l0,-2147483646xe" stroked="f" o:allowincell="f" style="position:absolute;margin-left:157.9pt;margin-top:28.9pt;width:57.7pt;height:24.4pt;mso-wrap-style:square;v-text-anchor:top" wp14:anchorId="55E8B8D8">
+              <v:rect id="shape_0" stroked="f" o:allowincell="f" style="position:absolute;margin-left:157.9pt;margin-top:28.9pt;width:57.7pt;height:24.4pt;mso-wrap-style:square;v-text-anchor:top" wp14:anchorId="55E8B8D8">
                 <v:fill o:detectmouseclick="t" on="false"/>
                 <v:stroke color="#3465a4" joinstyle="round" endcap="flat"/>
                 <v:textbox>
                   <w:txbxContent>
                     <w:p>
                       <w:pPr>
-                        <w:pStyle w:val="Contedodoquadro"/>
+                        <w:pStyle w:val="Contedodoquadrouser"/>
                         <w:rPr/>
                       </w:pPr>
                       <w:r>
@@ -1224,7 +1245,7 @@
         <mc:AlternateContent>
           <mc:Choice Requires="wps">
             <w:drawing>
-              <wp:anchor behindDoc="0" distT="0" distB="0" distL="0" distR="0" simplePos="0" locked="0" layoutInCell="1" allowOverlap="1" relativeHeight="26" wp14:anchorId="105955CE">
+              <wp:anchor distT="0" distB="0" distL="0" distR="0" simplePos="0" relativeHeight="20" behindDoc="0" locked="0" layoutInCell="1" allowOverlap="1" wp14:anchorId="105955CE">
                 <wp:simplePos x="0" y="0"/>
                 <wp:positionH relativeFrom="column">
                   <wp:posOffset>2704465</wp:posOffset>
@@ -1263,7 +1284,7 @@
                         <w:txbxContent>
                           <w:p>
                             <w:pPr>
-                              <w:pStyle w:val="Contedodoquadro"/>
+                              <w:pStyle w:val="Contedodoquadrouser"/>
                               <w:rPr/>
                             </w:pPr>
                             <w:r>
@@ -1285,14 +1306,14 @@
           </mc:Choice>
           <mc:Fallback>
             <w:pict>
-              <v:rect id="shape_0" ID="Caixa de Texto 14" path="m0,0l-2147483645,0l-2147483645,-2147483646l0,-2147483646xe" stroked="f" o:allowincell="f" style="position:absolute;margin-left:212.95pt;margin-top:29.7pt;width:94.35pt;height:24.4pt;mso-wrap-style:square;v-text-anchor:top" wp14:anchorId="105955CE">
+              <v:rect id="shape_0" stroked="f" o:allowincell="f" style="position:absolute;margin-left:212.95pt;margin-top:29.7pt;width:94.35pt;height:24.4pt;mso-wrap-style:square;v-text-anchor:top" wp14:anchorId="105955CE">
                 <v:fill o:detectmouseclick="t" on="false"/>
                 <v:stroke color="#3465a4" joinstyle="round" endcap="flat"/>
                 <v:textbox>
                   <w:txbxContent>
                     <w:p>
                       <w:pPr>
-                        <w:pStyle w:val="Contedodoquadro"/>
+                        <w:pStyle w:val="Contedodoquadrouser"/>
                         <w:rPr/>
                       </w:pPr>
                       <w:r>
@@ -1310,7 +1331,7 @@
         <mc:AlternateContent>
           <mc:Choice Requires="wps">
             <w:drawing>
-              <wp:anchor behindDoc="0" distT="0" distB="3175" distL="0" distR="0" simplePos="0" locked="0" layoutInCell="1" allowOverlap="1" relativeHeight="28" wp14:anchorId="317DD299">
+              <wp:anchor distT="0" distB="3175" distL="0" distR="0" simplePos="0" relativeHeight="22" behindDoc="0" locked="0" layoutInCell="1" allowOverlap="1" wp14:anchorId="317DD299">
                 <wp:simplePos x="0" y="0"/>
                 <wp:positionH relativeFrom="column">
                   <wp:posOffset>4403725</wp:posOffset>
@@ -1349,7 +1370,7 @@
                         <w:txbxContent>
                           <w:p>
                             <w:pPr>
-                              <w:pStyle w:val="Contedodoquadro"/>
+                              <w:pStyle w:val="Contedodoquadrouser"/>
                               <w:rPr/>
                             </w:pPr>
                             <w:r>
@@ -1371,14 +1392,14 @@
           </mc:Choice>
           <mc:Fallback>
             <w:pict>
-              <v:rect id="shape_0" ID="Caixa de Texto 15" path="m0,0l-2147483645,0l-2147483645,-2147483646l0,-2147483646xe" stroked="f" o:allowincell="f" style="position:absolute;margin-left:346.75pt;margin-top:30.35pt;width:67.85pt;height:23.7pt;mso-wrap-style:square;v-text-anchor:top" wp14:anchorId="317DD299">
+              <v:rect id="shape_0" stroked="f" o:allowincell="f" style="position:absolute;margin-left:346.75pt;margin-top:30.35pt;width:67.85pt;height:23.7pt;mso-wrap-style:square;v-text-anchor:top" wp14:anchorId="317DD299">
                 <v:fill o:detectmouseclick="t" on="false"/>
                 <v:stroke color="#3465a4" joinstyle="round" endcap="flat"/>
                 <v:textbox>
                   <w:txbxContent>
                     <w:p>
                       <w:pPr>
-                        <w:pStyle w:val="Contedodoquadro"/>
+                        <w:pStyle w:val="Contedodoquadrouser"/>
                         <w:rPr/>
                       </w:pPr>
                       <w:r>
@@ -1404,8 +1425,8 @@
     <w:p>
       <w:pPr>
         <w:pStyle w:val="Normal"/>
-        <w:spacing w:lineRule="auto" w:line="259" w:before="0" w:after="449"/>
-        <w:ind w:hanging="10" w:left="10" w:right="4"/>
+        <w:spacing w:lineRule="auto" w:line="262" w:before="0" w:after="449"/>
+        <w:ind w:hanging="10" w:start="10" w:end="4"/>
         <w:jc w:val="center"/>
         <w:rPr/>
       </w:pPr>
@@ -1418,7 +1439,7 @@
       <w:pPr>
         <w:pStyle w:val="Normal"/>
         <w:spacing w:lineRule="auto" w:line="259" w:before="0" w:after="420"/>
-        <w:jc w:val="left"/>
+        <w:jc w:val="start"/>
         <w:rPr/>
       </w:pPr>
       <w:r>
@@ -1431,8 +1452,8 @@
     <w:p>
       <w:pPr>
         <w:pStyle w:val="Normal"/>
-        <w:spacing w:lineRule="auto" w:line="259" w:before="0" w:after="156"/>
-        <w:ind w:hanging="10" w:left="10" w:right="6"/>
+        <w:spacing w:lineRule="auto" w:line="262" w:before="0" w:after="156"/>
+        <w:ind w:hanging="10" w:start="10" w:end="6"/>
         <w:jc w:val="center"/>
         <w:rPr/>
       </w:pPr>
@@ -1440,7 +1461,7 @@
         <mc:AlternateContent>
           <mc:Choice Requires="wps">
             <w:drawing>
-              <wp:anchor behindDoc="0" distT="0" distB="1270" distL="0" distR="0" simplePos="0" locked="0" layoutInCell="0" allowOverlap="1" relativeHeight="32" wp14:anchorId="1D36E4D1">
+              <wp:anchor distT="0" distB="1270" distL="0" distR="0" simplePos="0" relativeHeight="30" behindDoc="0" locked="0" layoutInCell="0" allowOverlap="1" wp14:anchorId="1D36E4D1">
                 <wp:simplePos x="0" y="0"/>
                 <wp:positionH relativeFrom="margin">
                   <wp:posOffset>1417955</wp:posOffset>
@@ -1479,7 +1500,7 @@
                         <w:txbxContent>
                           <w:p>
                             <w:pPr>
-                              <w:pStyle w:val="Contedodoquadro"/>
+                              <w:pStyle w:val="Contedodoquadrouser"/>
                               <w:rPr/>
                             </w:pPr>
                             <w:r>
@@ -1489,7 +1510,7 @@
                           </w:p>
                           <w:p>
                             <w:pPr>
-                              <w:pStyle w:val="Contedodoquadro"/>
+                              <w:pStyle w:val="Contedodoquadrouser"/>
                               <w:rPr/>
                             </w:pPr>
                             <w:r>
@@ -1510,14 +1531,14 @@
           </mc:Choice>
           <mc:Fallback>
             <w:pict>
-              <v:rect id="shape_0" ID="Caixa de Texto 17" path="m0,0l-2147483645,0l-2147483645,-2147483646l0,-2147483646xe" stroked="f" o:allowincell="f" style="position:absolute;margin-left:111.65pt;margin-top:11.4pt;width:256.05pt;height:22.35pt;mso-wrap-style:square;v-text-anchor:top;mso-position-horizontal-relative:margin" wp14:anchorId="1D36E4D1">
+              <v:rect id="shape_0" stroked="f" o:allowincell="f" style="position:absolute;margin-left:111.65pt;margin-top:11.4pt;width:256.05pt;height:22.35pt;mso-wrap-style:square;v-text-anchor:top;mso-position-horizontal-relative:margin" wp14:anchorId="1D36E4D1">
                 <v:fill o:detectmouseclick="t" on="false"/>
                 <v:stroke color="#3465a4" joinstyle="round" endcap="flat"/>
                 <v:textbox>
                   <w:txbxContent>
                     <w:p>
                       <w:pPr>
-                        <w:pStyle w:val="Contedodoquadro"/>
+                        <w:pStyle w:val="Contedodoquadrouser"/>
                         <w:rPr/>
                       </w:pPr>
                       <w:r>
@@ -1527,7 +1548,7 @@
                     </w:p>
                     <w:p>
                       <w:pPr>
-                        <w:pStyle w:val="Contedodoquadro"/>
+                        <w:pStyle w:val="Contedodoquadrouser"/>
                         <w:rPr/>
                       </w:pPr>
                       <w:r>
@@ -1978,7 +1999,7 @@
     </w:rPr>
   </w:style>
   <w:style w:type="paragraph" w:styleId="Heading1">
-    <w:name w:val="Heading 1"/>
+    <w:name w:val="heading 1"/>
     <w:next w:val="Normal"/>
     <w:link w:val="Ttulo1Char"/>
     <w:uiPriority w:val="9"/>
@@ -1990,7 +2011,7 @@
       <w:suppressAutoHyphens w:val="true"/>
       <w:bidi w:val="0"/>
       <w:spacing w:lineRule="auto" w:line="259" w:before="0" w:after="0"/>
-      <w:ind w:right="2"/>
+      <w:ind w:end="2"/>
       <w:jc w:val="center"/>
       <w:outlineLvl w:val="0"/>
     </w:pPr>
@@ -2008,12 +2029,10 @@
     <w:uiPriority w:val="1"/>
     <w:semiHidden/>
     <w:unhideWhenUsed/>
-    <w:qFormat/>
     <w:rPr/>
   </w:style>
   <w:style w:type="character" w:styleId="Ttulo1Char" w:customStyle="1">
     <w:name w:val="Título 1 Char"/>
-    <w:qFormat/>
     <w:rPr>
       <w:rFonts w:ascii="Arial" w:hAnsi="Arial" w:eastAsia="Arial" w:cs="Arial"/>
       <w:color w:val="000000"/>
@@ -2024,13 +2043,12 @@
     <w:name w:val="Título"/>
     <w:basedOn w:val="Normal"/>
     <w:next w:val="BodyText"/>
-    <w:qFormat/>
     <w:pPr>
       <w:keepNext w:val="true"/>
       <w:spacing w:before="240" w:after="120"/>
     </w:pPr>
     <w:rPr>
-      <w:rFonts w:ascii="Liberation Sans" w:hAnsi="Liberation Sans" w:eastAsia="Noto Sans CJK SC" w:cs="Noto Sans Devanagari"/>
+      <w:rFonts w:ascii="Liberation Sans" w:hAnsi="Liberation Sans" w:eastAsia="Microsoft YaHei" w:cs="Lucida Sans"/>
       <w:sz w:val="28"/>
       <w:szCs w:val="28"/>
     </w:rPr>
@@ -2048,19 +2066,18 @@
     <w:basedOn w:val="BodyText"/>
     <w:pPr/>
     <w:rPr>
-      <w:rFonts w:cs="Noto Sans Devanagari"/>
+      <w:rFonts w:cs="Lucida Sans"/>
     </w:rPr>
   </w:style>
   <w:style w:type="paragraph" w:styleId="Caption">
-    <w:name w:val="Caption"/>
+    <w:name w:val="caption"/>
     <w:basedOn w:val="Normal"/>
-    <w:qFormat/>
     <w:pPr>
       <w:suppressLineNumbers/>
       <w:spacing w:before="120" w:after="120"/>
     </w:pPr>
     <w:rPr>
-      <w:rFonts w:cs="Noto Sans Devanagari"/>
+      <w:rFonts w:cs="Lucida Sans"/>
       <w:i/>
       <w:iCs/>
       <w:sz w:val="24"/>
@@ -2070,27 +2087,54 @@
   <w:style w:type="paragraph" w:styleId="ndice">
     <w:name w:val="Índice"/>
     <w:basedOn w:val="Normal"/>
-    <w:qFormat/>
     <w:pPr>
       <w:suppressLineNumbers/>
     </w:pPr>
     <w:rPr>
-      <w:rFonts w:cs="Noto Sans Devanagari"/>
+      <w:rFonts w:cs="Lucida Sans"/>
     </w:rPr>
+  </w:style>
+  <w:style w:type="paragraph" w:styleId="Ttulouser">
+    <w:name w:val="Título (user)"/>
+    <w:basedOn w:val="Normal"/>
+    <w:next w:val="BodyText"/>
+    <w:pPr>
+      <w:keepNext w:val="true"/>
+      <w:spacing w:before="240" w:after="120"/>
+    </w:pPr>
+    <w:rPr>
+      <w:rFonts w:ascii="Liberation Sans" w:hAnsi="Liberation Sans" w:eastAsia="Microsoft YaHei" w:cs="Lucida Sans"/>
+      <w:sz w:val="28"/>
+      <w:szCs w:val="28"/>
+    </w:rPr>
+  </w:style>
+  <w:style w:type="paragraph" w:styleId="ndiceuser">
+    <w:name w:val="Índice (user)"/>
+    <w:basedOn w:val="Normal"/>
+    <w:pPr>
+      <w:suppressLineNumbers/>
+    </w:pPr>
+    <w:rPr>
+      <w:rFonts w:cs="Lucida Sans"/>
+    </w:rPr>
+  </w:style>
+  <w:style w:type="paragraph" w:styleId="Contedodoquadrouser">
+    <w:name w:val="Conteúdo do quadro (user)"/>
+    <w:basedOn w:val="Normal"/>
+    <w:pPr/>
+    <w:rPr/>
   </w:style>
   <w:style w:type="paragraph" w:styleId="Contedodoquadro">
     <w:name w:val="Conteúdo do quadro"/>
     <w:basedOn w:val="Normal"/>
-    <w:qFormat/>
     <w:pPr/>
     <w:rPr/>
   </w:style>
-  <w:style w:type="numbering" w:styleId="Semlista" w:default="1">
-    <w:name w:val="Sem lista"/>
+  <w:style w:type="numbering" w:styleId="Semlistauser" w:default="1">
+    <w:name w:val="Sem lista (user)"/>
     <w:uiPriority w:val="99"/>
     <w:semiHidden/>
     <w:unhideWhenUsed/>
-    <w:qFormat/>
   </w:style>
   <w:style w:type="table" w:default="1" w:styleId="Tabelanormal">
     <w:name w:val="Normal Table"/>
@@ -2117,37 +2161,37 @@
         <a:srgbClr val="000000"/>
       </a:dk1>
       <a:lt1>
-        <a:srgbClr val="ffffff"/>
+        <a:srgbClr val="FFFFFF"/>
       </a:lt1>
       <a:dk2>
-        <a:srgbClr val="44546a"/>
+        <a:srgbClr val="44546A"/>
       </a:dk2>
       <a:lt2>
-        <a:srgbClr val="e7e6e6"/>
+        <a:srgbClr val="E7E6E6"/>
       </a:lt2>
       <a:accent1>
-        <a:srgbClr val="4472c4"/>
+        <a:srgbClr val="4472C4"/>
       </a:accent1>
       <a:accent2>
-        <a:srgbClr val="ed7d31"/>
+        <a:srgbClr val="ED7D31"/>
       </a:accent2>
       <a:accent3>
-        <a:srgbClr val="a5a5a5"/>
+        <a:srgbClr val="A5A5A5"/>
       </a:accent3>
       <a:accent4>
-        <a:srgbClr val="ffc000"/>
+        <a:srgbClr val="FFC000"/>
       </a:accent4>
       <a:accent5>
-        <a:srgbClr val="5b9bd5"/>
+        <a:srgbClr val="5B9BD5"/>
       </a:accent5>
       <a:accent6>
-        <a:srgbClr val="70ad47"/>
+        <a:srgbClr val="70AD47"/>
       </a:accent6>
       <a:hlink>
-        <a:srgbClr val="0563c1"/>
+        <a:srgbClr val="0563C1"/>
       </a:hlink>
       <a:folHlink>
-        <a:srgbClr val="954f72"/>
+        <a:srgbClr val="954F72"/>
       </a:folHlink>
     </a:clrScheme>
     <a:fontScheme name="Office">
@@ -2155,11 +2199,105 @@
         <a:latin typeface="Calibri Light" panose="020F0302020204030204" pitchFamily="0" charset="1"/>
         <a:ea typeface=""/>
         <a:cs typeface=""/>
+        <a:font script="Jpan" typeface="游ゴシック Light"/>
+        <a:font script="Hang" typeface="맑은 고딕"/>
+        <a:font script="Hans" typeface="等线 Light"/>
+        <a:font script="Hant" typeface="新細明體"/>
+        <a:font script="Arab" typeface="Times New Roman"/>
+        <a:font script="Hebr" typeface="Times New Roman"/>
+        <a:font script="Thai" typeface="Angsana New"/>
+        <a:font script="Ethi" typeface="Nyala"/>
+        <a:font script="Beng" typeface="Vrinda"/>
+        <a:font script="Gujr" typeface="Shruti"/>
+        <a:font script="Khmr" typeface="MoolBoran"/>
+        <a:font script="Knda" typeface="Tunga"/>
+        <a:font script="Guru" typeface="Raavi"/>
+        <a:font script="Cans" typeface="Euphemia"/>
+        <a:font script="Cher" typeface="Plantagenet Cherokee"/>
+        <a:font script="Yiii" typeface="Microsoft Yi Baiti"/>
+        <a:font script="Tibt" typeface="Microsoft Himalaya"/>
+        <a:font script="Thaa" typeface="MV Boli"/>
+        <a:font script="Deva" typeface="Mangal"/>
+        <a:font script="Telu" typeface="Gautami"/>
+        <a:font script="Taml" typeface="Latha"/>
+        <a:font script="Syrc" typeface="Estrangelo Edessa"/>
+        <a:font script="Orya" typeface="Kalinga"/>
+        <a:font script="Mlym" typeface="Kartika"/>
+        <a:font script="Laoo" typeface="DokChampa"/>
+        <a:font script="Sinh" typeface="Iskoola Pota"/>
+        <a:font script="Mong" typeface="Mongolian Baiti"/>
+        <a:font script="Viet" typeface="Times New Roman"/>
+        <a:font script="Uigh" typeface="Microsoft Uighur"/>
+        <a:font script="Geor" typeface="Sylfaen"/>
+        <a:font script="Armn" typeface="Arial"/>
+        <a:font script="Bugi" typeface="Leelawadee UI"/>
+        <a:font script="Bopo" typeface="Microsoft JhengHei"/>
+        <a:font script="Java" typeface="Javanese Text"/>
+        <a:font script="Lisu" typeface="Segoe UI"/>
+        <a:font script="Mymr" typeface="Myanmar Text"/>
+        <a:font script="Nkoo" typeface="Ebrima"/>
+        <a:font script="Olck" typeface="Nirmala UI"/>
+        <a:font script="Osma" typeface="Ebrima"/>
+        <a:font script="Phag" typeface="Phagspa"/>
+        <a:font script="Syrn" typeface="Estrangelo Edessa"/>
+        <a:font script="Syrj" typeface="Estrangelo Edessa"/>
+        <a:font script="Syre" typeface="Estrangelo Edessa"/>
+        <a:font script="Sora" typeface="Nirmala UI"/>
+        <a:font script="Tale" typeface="Microsoft Tai Le"/>
+        <a:font script="Talu" typeface="Microsoft New Tai Lue"/>
+        <a:font script="Tfng" typeface="Ebrima"/>
       </a:majorFont>
       <a:minorFont>
         <a:latin typeface="Calibri" panose="020F0502020204030204" pitchFamily="0" charset="1"/>
         <a:ea typeface=""/>
         <a:cs typeface=""/>
+        <a:font script="Jpan" typeface="游明朝"/>
+        <a:font script="Hang" typeface="맑은 고딕"/>
+        <a:font script="Hans" typeface="等线"/>
+        <a:font script="Hant" typeface="新細明體"/>
+        <a:font script="Arab" typeface="Arial"/>
+        <a:font script="Hebr" typeface="Arial"/>
+        <a:font script="Thai" typeface="Cordia New"/>
+        <a:font script="Ethi" typeface="Nyala"/>
+        <a:font script="Beng" typeface="Vrinda"/>
+        <a:font script="Gujr" typeface="Shruti"/>
+        <a:font script="Khmr" typeface="DaunPenh"/>
+        <a:font script="Knda" typeface="Tunga"/>
+        <a:font script="Guru" typeface="Raavi"/>
+        <a:font script="Cans" typeface="Euphemia"/>
+        <a:font script="Cher" typeface="Plantagenet Cherokee"/>
+        <a:font script="Yiii" typeface="Microsoft Yi Baiti"/>
+        <a:font script="Tibt" typeface="Microsoft Himalaya"/>
+        <a:font script="Thaa" typeface="MV Boli"/>
+        <a:font script="Deva" typeface="Mangal"/>
+        <a:font script="Telu" typeface="Gautami"/>
+        <a:font script="Taml" typeface="Latha"/>
+        <a:font script="Syrc" typeface="Estrangelo Edessa"/>
+        <a:font script="Orya" typeface="Kalinga"/>
+        <a:font script="Mlym" typeface="Kartika"/>
+        <a:font script="Laoo" typeface="DokChampa"/>
+        <a:font script="Sinh" typeface="Iskoola Pota"/>
+        <a:font script="Mong" typeface="Mongolian Baiti"/>
+        <a:font script="Viet" typeface="Arial"/>
+        <a:font script="Uigh" typeface="Microsoft Uighur"/>
+        <a:font script="Geor" typeface="Sylfaen"/>
+        <a:font script="Armn" typeface="Arial"/>
+        <a:font script="Bugi" typeface="Leelawadee UI"/>
+        <a:font script="Bopo" typeface="Microsoft JhengHei"/>
+        <a:font script="Java" typeface="Javanese Text"/>
+        <a:font script="Lisu" typeface="Segoe UI"/>
+        <a:font script="Mymr" typeface="Myanmar Text"/>
+        <a:font script="Nkoo" typeface="Ebrima"/>
+        <a:font script="Olck" typeface="Nirmala UI"/>
+        <a:font script="Osma" typeface="Ebrima"/>
+        <a:font script="Phag" typeface="Phagspa"/>
+        <a:font script="Syrn" typeface="Estrangelo Edessa"/>
+        <a:font script="Syrj" typeface="Estrangelo Edessa"/>
+        <a:font script="Syre" typeface="Estrangelo Edessa"/>
+        <a:font script="Sora" typeface="Nirmala UI"/>
+        <a:font script="Tale" typeface="Microsoft Tai Le"/>
+        <a:font script="Talu" typeface="Microsoft New Tai Lue"/>
+        <a:font script="Tfng" typeface="Ebrima"/>
       </a:minorFont>
     </a:fontScheme>
     <a:fmtScheme>

</xml_diff>

<commit_message>
Revert "ajustei posicao das caixas no template residencia propria"
This reverts commit bd585e7d03a403d6317f2efb40598cc6bbfea270.
</commit_message>
<xml_diff>
--- a/resources/templates/residencia_propria_new.docx
+++ b/resources/templates/residencia_propria_new.docx
@@ -1,12 +1,12 @@
 
 <file path=word/document.xml><?xml version="1.0" encoding="utf-8"?>
-<w:document xmlns:o="urn:schemas-microsoft-com:office:office" xmlns:r="http://schemas.openxmlformats.org/officeDocument/2006/relationships" xmlns:v="urn:schemas-microsoft-com:vml" xmlns:w="http://schemas.openxmlformats.org/wordprocessingml/2006/main" xmlns:w10="urn:schemas-microsoft-com:office:word" xmlns:wp="http://schemas.openxmlformats.org/drawingml/2006/wordprocessingDrawing" xmlns:pic="http://schemas.openxmlformats.org/drawingml/2006/picture" xmlns:wps="http://schemas.microsoft.com/office/word/2010/wordprocessingShape" xmlns:wpg="http://schemas.microsoft.com/office/word/2010/wordprocessingGroup" xmlns:mc="http://schemas.openxmlformats.org/markup-compatibility/2006" xmlns:wp14="http://schemas.microsoft.com/office/word/2010/wordprocessingDrawing" xmlns:w14="http://schemas.microsoft.com/office/word/2010/wordml" xmlns:w15="http://schemas.microsoft.com/office/word/2012/wordml" mc:Ignorable="w14 wp14 w15">
+<w:document xmlns:o="urn:schemas-microsoft-com:office:office" xmlns:r="http://schemas.openxmlformats.org/officeDocument/2006/relationships" xmlns:v="urn:schemas-microsoft-com:vml" xmlns:w="http://schemas.openxmlformats.org/wordprocessingml/2006/main" xmlns:w10="urn:schemas-microsoft-com:office:word" xmlns:wp="http://schemas.openxmlformats.org/drawingml/2006/wordprocessingDrawing" xmlns:wps="http://schemas.microsoft.com/office/word/2010/wordprocessingShape" xmlns:wpg="http://schemas.microsoft.com/office/word/2010/wordprocessingGroup" xmlns:mc="http://schemas.openxmlformats.org/markup-compatibility/2006" xmlns:wp14="http://schemas.microsoft.com/office/word/2010/wordprocessingDrawing" xmlns:w14="http://schemas.microsoft.com/office/word/2010/wordml" xmlns:w15="http://schemas.microsoft.com/office/word/2012/wordml" mc:Ignorable="w14 wp14 w15">
   <w:body>
     <w:p>
       <w:pPr>
         <w:pStyle w:val="Normal"/>
         <w:spacing w:lineRule="auto" w:line="259" w:before="0" w:after="88"/>
-        <w:ind w:end="55"/>
+        <w:ind w:right="55"/>
         <w:jc w:val="center"/>
         <w:rPr/>
       </w:pPr>
@@ -23,21 +23,33 @@
       <w:pPr>
         <w:pStyle w:val="Normal"/>
         <w:spacing w:lineRule="auto" w:line="259" w:before="0" w:after="355"/>
-        <w:ind w:start="11"/>
+        <w:ind w:left="11"/>
         <w:jc w:val="center"/>
+        <w:rPr/>
+      </w:pPr>
+      <w:r>
+        <w:rPr>
+          <w:sz w:val="6"/>
+        </w:rPr>
+        <w:t xml:space="preserve"> </w:t>
+      </w:r>
+    </w:p>
+    <w:p>
+      <w:pPr>
+        <w:pStyle w:val="Normal"/>
         <w:rPr/>
       </w:pPr>
       <w:r>
         <mc:AlternateContent>
           <mc:Choice Requires="wps">
             <w:drawing>
-              <wp:anchor distT="0" distB="0" distL="0" distR="0" simplePos="0" relativeHeight="2" behindDoc="0" locked="0" layoutInCell="1" allowOverlap="1" wp14:anchorId="16F6CF6A">
+              <wp:anchor behindDoc="0" distT="0" distB="0" distL="0" distR="0" simplePos="0" locked="0" layoutInCell="1" allowOverlap="1" relativeHeight="2" wp14:anchorId="16F6CF6A">
                 <wp:simplePos x="0" y="0"/>
                 <wp:positionH relativeFrom="column">
                   <wp:posOffset>340360</wp:posOffset>
                 </wp:positionH>
                 <wp:positionV relativeFrom="paragraph">
-                  <wp:posOffset>365125</wp:posOffset>
+                  <wp:posOffset>-21590</wp:posOffset>
                 </wp:positionV>
                 <wp:extent cx="4675505" cy="270510"/>
                 <wp:effectExtent l="0" t="0" r="0" b="0"/>
@@ -70,7 +82,7 @@
                         <w:txbxContent>
                           <w:p>
                             <w:pPr>
-                              <w:pStyle w:val="Contedodoquadrouser"/>
+                              <w:pStyle w:val="Contedodoquadro"/>
                               <w:rPr/>
                             </w:pPr>
                             <w:r>
@@ -92,14 +104,14 @@
           </mc:Choice>
           <mc:Fallback>
             <w:pict>
-              <v:rect id="shape_0" stroked="f" o:allowincell="f" style="position:absolute;margin-left:26.8pt;margin-top:28.75pt;width:368.1pt;height:21.25pt;mso-wrap-style:square;v-text-anchor:top" wp14:anchorId="16F6CF6A">
+              <v:rect id="shape_0" ID="Caixa de Texto 1" path="m0,0l-2147483645,0l-2147483645,-2147483646l0,-2147483646xe" stroked="f" o:allowincell="f" style="position:absolute;margin-left:26.8pt;margin-top:-1.7pt;width:368.1pt;height:21.25pt;mso-wrap-style:square;v-text-anchor:top" wp14:anchorId="16F6CF6A">
                 <v:fill o:detectmouseclick="t" on="false"/>
                 <v:stroke color="#3465a4" joinstyle="round" endcap="flat"/>
                 <v:textbox>
                   <w:txbxContent>
                     <w:p>
                       <w:pPr>
-                        <w:pStyle w:val="Contedodoquadrouser"/>
+                        <w:pStyle w:val="Contedodoquadro"/>
                         <w:rPr/>
                       </w:pPr>
                       <w:r>
@@ -114,24 +126,10 @@
             </w:pict>
           </mc:Fallback>
         </mc:AlternateContent>
-      </w:r>
-      <w:r>
-        <w:rPr>
-          <w:sz w:val="6"/>
-        </w:rPr>
-        <w:t xml:space="preserve"> </w:t>
-      </w:r>
-    </w:p>
-    <w:p>
-      <w:pPr>
-        <w:pStyle w:val="Normal"/>
-        <w:rPr/>
-      </w:pPr>
-      <w:r>
         <mc:AlternateContent>
           <mc:Choice Requires="wps">
             <w:drawing>
-              <wp:anchor distT="0" distB="0" distL="0" distR="0" simplePos="0" relativeHeight="4" behindDoc="0" locked="0" layoutInCell="1" allowOverlap="1" wp14:anchorId="0A09468B">
+              <wp:anchor behindDoc="0" distT="0" distB="0" distL="0" distR="0" simplePos="0" locked="0" layoutInCell="1" allowOverlap="1" relativeHeight="4" wp14:anchorId="0A09468B">
                 <wp:simplePos x="0" y="0"/>
                 <wp:positionH relativeFrom="column">
                   <wp:posOffset>1039495</wp:posOffset>
@@ -170,7 +168,7 @@
                         <w:txbxContent>
                           <w:p>
                             <w:pPr>
-                              <w:pStyle w:val="Contedodoquadrouser"/>
+                              <w:pStyle w:val="Contedodoquadro"/>
                               <w:rPr/>
                             </w:pPr>
                             <w:r>
@@ -192,14 +190,14 @@
           </mc:Choice>
           <mc:Fallback>
             <w:pict>
-              <v:rect id="shape_0" stroked="f" o:allowincell="f" style="position:absolute;margin-left:81.85pt;margin-top:23.85pt;width:105.25pt;height:21.7pt;mso-wrap-style:square;v-text-anchor:top" wp14:anchorId="0A09468B">
+              <v:rect id="shape_0" ID="Caixa de Texto 2" path="m0,0l-2147483645,0l-2147483645,-2147483646l0,-2147483646xe" stroked="f" o:allowincell="f" style="position:absolute;margin-left:81.85pt;margin-top:23.85pt;width:105.25pt;height:21.7pt;mso-wrap-style:square;v-text-anchor:top" wp14:anchorId="0A09468B">
                 <v:fill o:detectmouseclick="t" on="false"/>
                 <v:stroke color="#3465a4" joinstyle="round" endcap="flat"/>
                 <v:textbox>
                   <w:txbxContent>
                     <w:p>
                       <w:pPr>
-                        <w:pStyle w:val="Contedodoquadrouser"/>
+                        <w:pStyle w:val="Contedodoquadro"/>
                         <w:rPr/>
                       </w:pPr>
                       <w:r>
@@ -217,7 +215,7 @@
         <mc:AlternateContent>
           <mc:Choice Requires="wps">
             <w:drawing>
-              <wp:anchor distT="0" distB="1270" distL="0" distR="0" simplePos="0" relativeHeight="6" behindDoc="0" locked="0" layoutInCell="1" allowOverlap="1" wp14:anchorId="5321EB3C">
+              <wp:anchor behindDoc="0" distT="0" distB="1270" distL="0" distR="0" simplePos="0" locked="0" layoutInCell="1" allowOverlap="1" relativeHeight="6" wp14:anchorId="5321EB3C">
                 <wp:simplePos x="0" y="0"/>
                 <wp:positionH relativeFrom="column">
                   <wp:posOffset>3500120</wp:posOffset>
@@ -256,7 +254,7 @@
                         <w:txbxContent>
                           <w:p>
                             <w:pPr>
-                              <w:pStyle w:val="Contedodoquadrouser"/>
+                              <w:pStyle w:val="Contedodoquadro"/>
                               <w:rPr/>
                             </w:pPr>
                             <w:r>
@@ -278,14 +276,14 @@
           </mc:Choice>
           <mc:Fallback>
             <w:pict>
-              <v:rect id="shape_0" stroked="f" o:allowincell="f" style="position:absolute;margin-left:275.6pt;margin-top:23.35pt;width:227.2pt;height:22.35pt;mso-wrap-style:square;v-text-anchor:top" wp14:anchorId="5321EB3C">
+              <v:rect id="shape_0" ID="Caixa de Texto 4" path="m0,0l-2147483645,0l-2147483645,-2147483646l0,-2147483646xe" stroked="f" o:allowincell="f" style="position:absolute;margin-left:275.6pt;margin-top:23.35pt;width:227.2pt;height:22.35pt;mso-wrap-style:square;v-text-anchor:top" wp14:anchorId="5321EB3C">
                 <v:fill o:detectmouseclick="t" on="false"/>
                 <v:stroke color="#3465a4" joinstyle="round" endcap="flat"/>
                 <v:textbox>
                   <w:txbxContent>
                     <w:p>
                       <w:pPr>
-                        <w:pStyle w:val="Contedodoquadrouser"/>
+                        <w:pStyle w:val="Contedodoquadro"/>
                         <w:rPr/>
                       </w:pPr>
                       <w:r>
@@ -303,7 +301,93 @@
         <mc:AlternateContent>
           <mc:Choice Requires="wps">
             <w:drawing>
-              <wp:anchor distT="0" distB="0" distL="0" distR="0" simplePos="0" relativeHeight="8" behindDoc="0" locked="0" layoutInCell="1" allowOverlap="1" wp14:anchorId="2B0229CB">
+              <wp:anchor behindDoc="0" distT="0" distB="1270" distL="0" distR="0" simplePos="0" locked="0" layoutInCell="1" allowOverlap="1" relativeHeight="8" wp14:anchorId="72133C8F">
+                <wp:simplePos x="0" y="0"/>
+                <wp:positionH relativeFrom="column">
+                  <wp:posOffset>598805</wp:posOffset>
+                </wp:positionH>
+                <wp:positionV relativeFrom="paragraph">
+                  <wp:posOffset>643890</wp:posOffset>
+                </wp:positionV>
+                <wp:extent cx="1035050" cy="284480"/>
+                <wp:effectExtent l="0" t="0" r="0" b="1270"/>
+                <wp:wrapNone/>
+                <wp:docPr id="4" name="Caixa de Texto 5"/>
+                <a:graphic xmlns:a="http://schemas.openxmlformats.org/drawingml/2006/main">
+                  <a:graphicData uri="http://schemas.microsoft.com/office/word/2010/wordprocessingShape">
+                    <wps:wsp>
+                      <wps:cNvSpPr/>
+                      <wps:spPr>
+                        <a:xfrm>
+                          <a:off x="0" y="0"/>
+                          <a:ext cx="1035000" cy="284400"/>
+                        </a:xfrm>
+                        <a:prstGeom prst="rect">
+                          <a:avLst/>
+                        </a:prstGeom>
+                        <a:noFill/>
+                        <a:ln w="0">
+                          <a:noFill/>
+                        </a:ln>
+                      </wps:spPr>
+                      <wps:style>
+                        <a:lnRef idx="0"/>
+                        <a:fillRef idx="0"/>
+                        <a:effectRef idx="0"/>
+                        <a:fontRef idx="minor"/>
+                      </wps:style>
+                      <wps:txbx>
+                        <w:txbxContent>
+                          <w:p>
+                            <w:pPr>
+                              <w:pStyle w:val="Contedodoquadro"/>
+                              <w:rPr/>
+                            </w:pPr>
+                            <w:r>
+                              <w:rPr/>
+                              <w:t>${RG_ISSUER}</w:t>
+                            </w:r>
+                          </w:p>
+                        </w:txbxContent>
+                      </wps:txbx>
+                      <wps:bodyPr anchor="t">
+                        <a:prstTxWarp prst="textNoShape"/>
+                        <a:noAutofit/>
+                      </wps:bodyPr>
+                    </wps:wsp>
+                  </a:graphicData>
+                </a:graphic>
+              </wp:anchor>
+            </w:drawing>
+          </mc:Choice>
+          <mc:Fallback>
+            <w:pict>
+              <v:rect id="shape_0" ID="Caixa de Texto 5" path="m0,0l-2147483645,0l-2147483645,-2147483646l0,-2147483646xe" stroked="f" o:allowincell="f" style="position:absolute;margin-left:47.15pt;margin-top:50.7pt;width:81.45pt;height:22.35pt;mso-wrap-style:square;v-text-anchor:top" wp14:anchorId="72133C8F">
+                <v:fill o:detectmouseclick="t" on="false"/>
+                <v:stroke color="#3465a4" joinstyle="round" endcap="flat"/>
+                <v:textbox>
+                  <w:txbxContent>
+                    <w:p>
+                      <w:pPr>
+                        <w:pStyle w:val="Contedodoquadro"/>
+                        <w:rPr/>
+                      </w:pPr>
+                      <w:r>
+                        <w:rPr/>
+                        <w:t>${RG_ISSUER}</w:t>
+                      </w:r>
+                    </w:p>
+                  </w:txbxContent>
+                </v:textbox>
+                <w10:wrap type="none"/>
+              </v:rect>
+            </w:pict>
+          </mc:Fallback>
+        </mc:AlternateContent>
+        <mc:AlternateContent>
+          <mc:Choice Requires="wps">
+            <w:drawing>
+              <wp:anchor behindDoc="0" distT="0" distB="0" distL="0" distR="0" simplePos="0" locked="0" layoutInCell="1" allowOverlap="1" relativeHeight="10" wp14:anchorId="2B0229CB">
                 <wp:simplePos x="0" y="0"/>
                 <wp:positionH relativeFrom="column">
                   <wp:posOffset>1729740</wp:posOffset>
@@ -314,7 +398,7 @@
                 <wp:extent cx="1414780" cy="310515"/>
                 <wp:effectExtent l="0" t="0" r="0" b="0"/>
                 <wp:wrapNone/>
-                <wp:docPr id="4" name="Caixa de Texto 6"/>
+                <wp:docPr id="5" name="Caixa de Texto 6"/>
                 <a:graphic xmlns:a="http://schemas.openxmlformats.org/drawingml/2006/main">
                   <a:graphicData uri="http://schemas.microsoft.com/office/word/2010/wordprocessingShape">
                     <wps:wsp>
@@ -342,7 +426,7 @@
                         <w:txbxContent>
                           <w:p>
                             <w:pPr>
-                              <w:pStyle w:val="Contedodoquadrouser"/>
+                              <w:pStyle w:val="Contedodoquadro"/>
                               <w:rPr/>
                             </w:pPr>
                             <w:r>
@@ -364,14 +448,14 @@
           </mc:Choice>
           <mc:Fallback>
             <w:pict>
-              <v:rect id="shape_0" stroked="f" o:allowincell="f" style="position:absolute;margin-left:136.2pt;margin-top:50.05pt;width:111.35pt;height:24.4pt;mso-wrap-style:square;v-text-anchor:top" wp14:anchorId="2B0229CB">
+              <v:rect id="shape_0" ID="Caixa de Texto 6" path="m0,0l-2147483645,0l-2147483645,-2147483646l0,-2147483646xe" stroked="f" o:allowincell="f" style="position:absolute;margin-left:136.2pt;margin-top:50.05pt;width:111.35pt;height:24.4pt;mso-wrap-style:square;v-text-anchor:top" wp14:anchorId="2B0229CB">
                 <v:fill o:detectmouseclick="t" on="false"/>
                 <v:stroke color="#3465a4" joinstyle="round" endcap="flat"/>
                 <v:textbox>
                   <w:txbxContent>
                     <w:p>
                       <w:pPr>
-                        <w:pStyle w:val="Contedodoquadrouser"/>
+                        <w:pStyle w:val="Contedodoquadro"/>
                         <w:rPr/>
                       </w:pPr>
                       <w:r>
@@ -389,7 +473,7 @@
         <mc:AlternateContent>
           <mc:Choice Requires="wps">
             <w:drawing>
-              <wp:anchor distT="0" distB="4445" distL="0" distR="0" simplePos="0" relativeHeight="10" behindDoc="0" locked="0" layoutInCell="1" allowOverlap="1" wp14:anchorId="5BB7462F">
+              <wp:anchor behindDoc="0" distT="0" distB="4445" distL="0" distR="0" simplePos="0" locked="0" layoutInCell="1" allowOverlap="1" relativeHeight="12" wp14:anchorId="5BB7462F">
                 <wp:simplePos x="0" y="0"/>
                 <wp:positionH relativeFrom="column">
                   <wp:posOffset>549275</wp:posOffset>
@@ -400,7 +484,7 @@
                 <wp:extent cx="1035050" cy="319405"/>
                 <wp:effectExtent l="0" t="0" r="0" b="5080"/>
                 <wp:wrapNone/>
-                <wp:docPr id="5" name="Caixa de Texto 7"/>
+                <wp:docPr id="6" name="Caixa de Texto 7"/>
                 <a:graphic xmlns:a="http://schemas.openxmlformats.org/drawingml/2006/main">
                   <a:graphicData uri="http://schemas.microsoft.com/office/word/2010/wordprocessingShape">
                     <wps:wsp>
@@ -428,7 +512,7 @@
                         <w:txbxContent>
                           <w:p>
                             <w:pPr>
-                              <w:pStyle w:val="Contedodoquadrouser"/>
+                              <w:pStyle w:val="Contedodoquadro"/>
                               <w:rPr/>
                             </w:pPr>
                             <w:r>
@@ -450,14 +534,14 @@
           </mc:Choice>
           <mc:Fallback>
             <w:pict>
-              <v:rect id="shape_0" stroked="f" o:allowincell="f" style="position:absolute;margin-left:43.25pt;margin-top:189.4pt;width:81.45pt;height:25.1pt;mso-wrap-style:square;v-text-anchor:top" wp14:anchorId="5BB7462F">
+              <v:rect id="shape_0" ID="Caixa de Texto 7" path="m0,0l-2147483645,0l-2147483645,-2147483646l0,-2147483646xe" stroked="f" o:allowincell="f" style="position:absolute;margin-left:43.25pt;margin-top:189.4pt;width:81.45pt;height:25.1pt;mso-wrap-style:square;v-text-anchor:top" wp14:anchorId="5BB7462F">
                 <v:fill o:detectmouseclick="t" on="false"/>
                 <v:stroke color="#3465a4" joinstyle="round" endcap="flat"/>
                 <v:textbox>
                   <w:txbxContent>
                     <w:p>
                       <w:pPr>
-                        <w:pStyle w:val="Contedodoquadrouser"/>
+                        <w:pStyle w:val="Contedodoquadro"/>
                         <w:rPr/>
                       </w:pPr>
                       <w:r>
@@ -475,18 +559,18 @@
         <mc:AlternateContent>
           <mc:Choice Requires="wps">
             <w:drawing>
-              <wp:anchor distT="0" distB="0" distL="0" distR="0" simplePos="0" relativeHeight="12" behindDoc="0" locked="0" layoutInCell="1" allowOverlap="1" wp14:anchorId="3E075AE0">
+              <wp:anchor behindDoc="0" distT="0" distB="0" distL="0" distR="0" simplePos="0" locked="0" layoutInCell="1" allowOverlap="1" relativeHeight="14" wp14:anchorId="2B51696E">
                 <wp:simplePos x="0" y="0"/>
                 <wp:positionH relativeFrom="column">
-                  <wp:posOffset>3143885</wp:posOffset>
+                  <wp:posOffset>324485</wp:posOffset>
                 </wp:positionH>
                 <wp:positionV relativeFrom="paragraph">
-                  <wp:posOffset>2754630</wp:posOffset>
+                  <wp:posOffset>2767330</wp:posOffset>
                 </wp:positionV>
-                <wp:extent cx="1848485" cy="293370"/>
+                <wp:extent cx="2673985" cy="326390"/>
                 <wp:effectExtent l="0" t="0" r="0" b="0"/>
                 <wp:wrapNone/>
-                <wp:docPr id="6" name="Caixa de Texto 9"/>
+                <wp:docPr id="7" name="Caixa de Texto 8"/>
                 <a:graphic xmlns:a="http://schemas.openxmlformats.org/drawingml/2006/main">
                   <a:graphicData uri="http://schemas.microsoft.com/office/word/2010/wordprocessingShape">
                     <wps:wsp>
@@ -494,7 +578,7 @@
                       <wps:spPr>
                         <a:xfrm>
                           <a:off x="0" y="0"/>
-                          <a:ext cx="1848600" cy="293400"/>
+                          <a:ext cx="2674080" cy="326520"/>
                         </a:xfrm>
                         <a:prstGeom prst="rect">
                           <a:avLst/>
@@ -514,93 +598,7 @@
                         <w:txbxContent>
                           <w:p>
                             <w:pPr>
-                              <w:pStyle w:val="Contedodoquadrouser"/>
-                              <w:rPr/>
-                            </w:pPr>
-                            <w:r>
-                              <w:rPr/>
-                              <w:t>${CITY}</w:t>
-                            </w:r>
-                          </w:p>
-                        </w:txbxContent>
-                      </wps:txbx>
-                      <wps:bodyPr anchor="t">
-                        <a:prstTxWarp prst="textNoShape"/>
-                        <a:noAutofit/>
-                      </wps:bodyPr>
-                    </wps:wsp>
-                  </a:graphicData>
-                </a:graphic>
-              </wp:anchor>
-            </w:drawing>
-          </mc:Choice>
-          <mc:Fallback>
-            <w:pict>
-              <v:rect id="shape_0" stroked="f" o:allowincell="f" style="position:absolute;margin-left:247.55pt;margin-top:216.9pt;width:145.5pt;height:23.05pt;mso-wrap-style:square;v-text-anchor:top" wp14:anchorId="3E075AE0">
-                <v:fill o:detectmouseclick="t" on="false"/>
-                <v:stroke color="#3465a4" joinstyle="round" endcap="flat"/>
-                <v:textbox>
-                  <w:txbxContent>
-                    <w:p>
-                      <w:pPr>
-                        <w:pStyle w:val="Contedodoquadrouser"/>
-                        <w:rPr/>
-                      </w:pPr>
-                      <w:r>
-                        <w:rPr/>
-                        <w:t>${CITY}</w:t>
-                      </w:r>
-                    </w:p>
-                  </w:txbxContent>
-                </v:textbox>
-                <w10:wrap type="none"/>
-              </v:rect>
-            </w:pict>
-          </mc:Fallback>
-        </mc:AlternateContent>
-        <mc:AlternateContent>
-          <mc:Choice Requires="wps">
-            <w:drawing>
-              <wp:anchor distT="0" distB="0" distL="0" distR="0" simplePos="0" relativeHeight="14" behindDoc="0" locked="0" layoutInCell="1" allowOverlap="1" wp14:anchorId="2B51696E">
-                <wp:simplePos x="0" y="0"/>
-                <wp:positionH relativeFrom="column">
-                  <wp:posOffset>407035</wp:posOffset>
-                </wp:positionH>
-                <wp:positionV relativeFrom="paragraph">
-                  <wp:posOffset>2728595</wp:posOffset>
-                </wp:positionV>
-                <wp:extent cx="2180590" cy="326390"/>
-                <wp:effectExtent l="0" t="0" r="0" b="0"/>
-                <wp:wrapNone/>
-                <wp:docPr id="7" name="Caixa de Texto 8"/>
-                <a:graphic xmlns:a="http://schemas.openxmlformats.org/drawingml/2006/main">
-                  <a:graphicData uri="http://schemas.microsoft.com/office/word/2010/wordprocessingShape">
-                    <wps:wsp>
-                      <wps:cNvSpPr/>
-                      <wps:spPr>
-                        <a:xfrm>
-                          <a:off x="0" y="0"/>
-                          <a:ext cx="2180520" cy="326520"/>
-                        </a:xfrm>
-                        <a:prstGeom prst="rect">
-                          <a:avLst/>
-                        </a:prstGeom>
-                        <a:noFill/>
-                        <a:ln w="0">
-                          <a:noFill/>
-                        </a:ln>
-                      </wps:spPr>
-                      <wps:style>
-                        <a:lnRef idx="0"/>
-                        <a:fillRef idx="0"/>
-                        <a:effectRef idx="0"/>
-                        <a:fontRef idx="minor"/>
-                      </wps:style>
-                      <wps:txbx>
-                        <w:txbxContent>
-                          <w:p>
-                            <w:pPr>
-                              <w:pStyle w:val="Contedodoquadrouser"/>
+                              <w:pStyle w:val="Contedodoquadro"/>
                               <w:rPr>
                                 <w:w w:val="75"/>
                                 <w:sz w:val="16"/>
@@ -627,14 +625,14 @@
           </mc:Choice>
           <mc:Fallback>
             <w:pict>
-              <v:rect id="shape_0" stroked="f" o:allowincell="f" style="position:absolute;margin-left:32.05pt;margin-top:214.85pt;width:171.65pt;height:25.65pt;mso-wrap-style:square;v-text-anchor:top" wp14:anchorId="2B51696E">
+              <v:rect id="shape_0" ID="Caixa de Texto 8" path="m0,0l-2147483645,0l-2147483645,-2147483646l0,-2147483646xe" stroked="f" o:allowincell="f" style="position:absolute;margin-left:25.55pt;margin-top:217.9pt;width:210.5pt;height:25.65pt;mso-wrap-style:square;v-text-anchor:top" wp14:anchorId="2B51696E">
                 <v:fill o:detectmouseclick="t" on="false"/>
                 <v:stroke color="#3465a4" joinstyle="round" endcap="flat"/>
                 <v:textbox>
                   <w:txbxContent>
                     <w:p>
                       <w:pPr>
-                        <w:pStyle w:val="Contedodoquadrouser"/>
+                        <w:pStyle w:val="Contedodoquadro"/>
                         <w:rPr>
                           <w:w w:val="75"/>
                           <w:sz w:val="16"/>
@@ -657,10 +655,96 @@
         <mc:AlternateContent>
           <mc:Choice Requires="wps">
             <w:drawing>
-              <wp:anchor distT="0" distB="0" distL="0" distR="0" simplePos="0" relativeHeight="24" behindDoc="0" locked="0" layoutInCell="1" allowOverlap="1" wp14:anchorId="7568324F">
+              <wp:anchor behindDoc="0" distT="0" distB="0" distL="0" distR="0" simplePos="0" locked="0" layoutInCell="1" allowOverlap="1" relativeHeight="16" wp14:anchorId="3E075AE0">
                 <wp:simplePos x="0" y="0"/>
                 <wp:positionH relativeFrom="column">
-                  <wp:posOffset>546735</wp:posOffset>
+                  <wp:posOffset>2782570</wp:posOffset>
+                </wp:positionH>
+                <wp:positionV relativeFrom="paragraph">
+                  <wp:posOffset>2767330</wp:posOffset>
+                </wp:positionV>
+                <wp:extent cx="2406650" cy="293370"/>
+                <wp:effectExtent l="0" t="0" r="0" b="0"/>
+                <wp:wrapNone/>
+                <wp:docPr id="8" name="Caixa de Texto 9"/>
+                <a:graphic xmlns:a="http://schemas.openxmlformats.org/drawingml/2006/main">
+                  <a:graphicData uri="http://schemas.microsoft.com/office/word/2010/wordprocessingShape">
+                    <wps:wsp>
+                      <wps:cNvSpPr/>
+                      <wps:spPr>
+                        <a:xfrm>
+                          <a:off x="0" y="0"/>
+                          <a:ext cx="2406600" cy="293400"/>
+                        </a:xfrm>
+                        <a:prstGeom prst="rect">
+                          <a:avLst/>
+                        </a:prstGeom>
+                        <a:noFill/>
+                        <a:ln w="0">
+                          <a:noFill/>
+                        </a:ln>
+                      </wps:spPr>
+                      <wps:style>
+                        <a:lnRef idx="0"/>
+                        <a:fillRef idx="0"/>
+                        <a:effectRef idx="0"/>
+                        <a:fontRef idx="minor"/>
+                      </wps:style>
+                      <wps:txbx>
+                        <w:txbxContent>
+                          <w:p>
+                            <w:pPr>
+                              <w:pStyle w:val="Contedodoquadro"/>
+                              <w:rPr/>
+                            </w:pPr>
+                            <w:r>
+                              <w:rPr/>
+                              <w:t>${CITY}</w:t>
+                            </w:r>
+                          </w:p>
+                        </w:txbxContent>
+                      </wps:txbx>
+                      <wps:bodyPr anchor="t">
+                        <a:prstTxWarp prst="textNoShape"/>
+                        <a:noAutofit/>
+                      </wps:bodyPr>
+                    </wps:wsp>
+                  </a:graphicData>
+                </a:graphic>
+              </wp:anchor>
+            </w:drawing>
+          </mc:Choice>
+          <mc:Fallback>
+            <w:pict>
+              <v:rect id="shape_0" ID="Caixa de Texto 9" path="m0,0l-2147483645,0l-2147483645,-2147483646l0,-2147483646xe" stroked="f" o:allowincell="f" style="position:absolute;margin-left:219.1pt;margin-top:217.9pt;width:189.45pt;height:23.05pt;mso-wrap-style:square;v-text-anchor:top" wp14:anchorId="3E075AE0">
+                <v:fill o:detectmouseclick="t" on="false"/>
+                <v:stroke color="#3465a4" joinstyle="round" endcap="flat"/>
+                <v:textbox>
+                  <w:txbxContent>
+                    <w:p>
+                      <w:pPr>
+                        <w:pStyle w:val="Contedodoquadro"/>
+                        <w:rPr/>
+                      </w:pPr>
+                      <w:r>
+                        <w:rPr/>
+                        <w:t>${CITY}</w:t>
+                      </w:r>
+                    </w:p>
+                  </w:txbxContent>
+                </v:textbox>
+                <w10:wrap type="none"/>
+              </v:rect>
+            </w:pict>
+          </mc:Fallback>
+        </mc:AlternateContent>
+        <mc:AlternateContent>
+          <mc:Choice Requires="wps">
+            <w:drawing>
+              <wp:anchor behindDoc="0" distT="0" distB="0" distL="0" distR="0" simplePos="0" locked="0" layoutInCell="1" allowOverlap="1" relativeHeight="18" wp14:anchorId="7568324F">
+                <wp:simplePos x="0" y="0"/>
+                <wp:positionH relativeFrom="column">
+                  <wp:posOffset>556895</wp:posOffset>
                 </wp:positionH>
                 <wp:positionV relativeFrom="paragraph">
                   <wp:posOffset>3103245</wp:posOffset>
@@ -668,7 +752,7 @@
                 <wp:extent cx="1517650" cy="293370"/>
                 <wp:effectExtent l="0" t="0" r="0" b="0"/>
                 <wp:wrapNone/>
-                <wp:docPr id="8" name="Caixa de Texto 10"/>
+                <wp:docPr id="9" name="Caixa de Texto 10"/>
                 <a:graphic xmlns:a="http://schemas.openxmlformats.org/drawingml/2006/main">
                   <a:graphicData uri="http://schemas.microsoft.com/office/word/2010/wordprocessingShape">
                     <wps:wsp>
@@ -696,7 +780,7 @@
                         <w:txbxContent>
                           <w:p>
                             <w:pPr>
-                              <w:pStyle w:val="Contedodoquadrouser"/>
+                              <w:pStyle w:val="Contedodoquadro"/>
                               <w:rPr/>
                             </w:pPr>
                             <w:r>
@@ -718,14 +802,14 @@
           </mc:Choice>
           <mc:Fallback>
             <w:pict>
-              <v:rect id="shape_0" stroked="f" o:allowincell="f" style="position:absolute;margin-left:43.05pt;margin-top:244.35pt;width:119.45pt;height:23.05pt;mso-wrap-style:square;v-text-anchor:top" wp14:anchorId="7568324F">
+              <v:rect id="shape_0" ID="Caixa de Texto 10" path="m0,0l-2147483645,0l-2147483645,-2147483646l0,-2147483646xe" stroked="f" o:allowincell="f" style="position:absolute;margin-left:43.85pt;margin-top:244.35pt;width:119.45pt;height:23.05pt;mso-wrap-style:square;v-text-anchor:top" wp14:anchorId="7568324F">
                 <v:fill o:detectmouseclick="t" on="false"/>
                 <v:stroke color="#3465a4" joinstyle="round" endcap="flat"/>
                 <v:textbox>
                   <w:txbxContent>
                     <w:p>
                       <w:pPr>
-                        <w:pStyle w:val="Contedodoquadrouser"/>
+                        <w:pStyle w:val="Contedodoquadro"/>
                         <w:rPr/>
                       </w:pPr>
                       <w:r>
@@ -743,18 +827,18 @@
         <mc:AlternateContent>
           <mc:Choice Requires="wps">
             <w:drawing>
-              <wp:anchor distT="0" distB="0" distL="0" distR="0" simplePos="0" relativeHeight="26" behindDoc="0" locked="0" layoutInCell="1" allowOverlap="1" wp14:anchorId="78ABDB51">
+              <wp:anchor behindDoc="0" distT="0" distB="0" distL="0" distR="0" simplePos="0" locked="0" layoutInCell="1" allowOverlap="1" relativeHeight="20" wp14:anchorId="78ABDB51">
                 <wp:simplePos x="0" y="0"/>
                 <wp:positionH relativeFrom="column">
-                  <wp:posOffset>2472690</wp:posOffset>
+                  <wp:posOffset>2403475</wp:posOffset>
                 </wp:positionH>
                 <wp:positionV relativeFrom="paragraph">
-                  <wp:posOffset>3090545</wp:posOffset>
+                  <wp:posOffset>3112135</wp:posOffset>
                 </wp:positionV>
                 <wp:extent cx="1405890" cy="293370"/>
                 <wp:effectExtent l="0" t="0" r="0" b="0"/>
                 <wp:wrapNone/>
-                <wp:docPr id="9" name="Caixa de Texto 11"/>
+                <wp:docPr id="10" name="Caixa de Texto 11"/>
                 <a:graphic xmlns:a="http://schemas.openxmlformats.org/drawingml/2006/main">
                   <a:graphicData uri="http://schemas.microsoft.com/office/word/2010/wordprocessingShape">
                     <wps:wsp>
@@ -782,7 +866,7 @@
                         <w:txbxContent>
                           <w:p>
                             <w:pPr>
-                              <w:pStyle w:val="Contedodoquadrouser"/>
+                              <w:pStyle w:val="Contedodoquadro"/>
                               <w:rPr/>
                             </w:pPr>
                             <w:r>
@@ -804,14 +888,14 @@
           </mc:Choice>
           <mc:Fallback>
             <w:pict>
-              <v:rect id="shape_0" stroked="f" o:allowincell="f" style="position:absolute;margin-left:194.7pt;margin-top:243.35pt;width:110.65pt;height:23.05pt;mso-wrap-style:square;v-text-anchor:top" wp14:anchorId="78ABDB51">
+              <v:rect id="shape_0" ID="Caixa de Texto 11" path="m0,0l-2147483645,0l-2147483645,-2147483646l0,-2147483646xe" stroked="f" o:allowincell="f" style="position:absolute;margin-left:189.25pt;margin-top:245.05pt;width:110.65pt;height:23.05pt;mso-wrap-style:square;v-text-anchor:top" wp14:anchorId="78ABDB51">
                 <v:fill o:detectmouseclick="t" on="false"/>
                 <v:stroke color="#3465a4" joinstyle="round" endcap="flat"/>
                 <v:textbox>
                   <w:txbxContent>
                     <w:p>
                       <w:pPr>
-                        <w:pStyle w:val="Contedodoquadrouser"/>
+                        <w:pStyle w:val="Contedodoquadro"/>
                         <w:rPr/>
                       </w:pPr>
                       <w:r>
@@ -829,7 +913,7 @@
         <mc:AlternateContent>
           <mc:Choice Requires="wps">
             <w:drawing>
-              <wp:anchor distT="0" distB="3175" distL="0" distR="0" simplePos="0" relativeHeight="28" behindDoc="0" locked="0" layoutInCell="1" allowOverlap="1" wp14:anchorId="492DB0C3">
+              <wp:anchor behindDoc="0" distT="0" distB="3175" distL="0" distR="0" simplePos="0" locked="0" layoutInCell="1" allowOverlap="1" relativeHeight="30" wp14:anchorId="492DB0C3">
                 <wp:simplePos x="0" y="0"/>
                 <wp:positionH relativeFrom="column">
                   <wp:posOffset>20955</wp:posOffset>
@@ -840,7 +924,7 @@
                 <wp:extent cx="3855720" cy="302260"/>
                 <wp:effectExtent l="0" t="0" r="0" b="3175"/>
                 <wp:wrapNone/>
-                <wp:docPr id="10" name="Caixa de Texto 16"/>
+                <wp:docPr id="11" name="Caixa de Texto 16"/>
                 <a:graphic xmlns:a="http://schemas.openxmlformats.org/drawingml/2006/main">
                   <a:graphicData uri="http://schemas.microsoft.com/office/word/2010/wordprocessingShape">
                     <wps:wsp>
@@ -868,7 +952,7 @@
                         <w:txbxContent>
                           <w:p>
                             <w:pPr>
-                              <w:pStyle w:val="Contedodoquadrouser"/>
+                              <w:pStyle w:val="Contedodoquadro"/>
                               <w:rPr/>
                             </w:pPr>
                             <w:r>
@@ -890,14 +974,14 @@
           </mc:Choice>
           <mc:Fallback>
             <w:pict>
-              <v:rect id="shape_0" stroked="f" o:allowincell="f" style="position:absolute;margin-left:1.65pt;margin-top:161.45pt;width:303.55pt;height:23.75pt;mso-wrap-style:square;v-text-anchor:top" wp14:anchorId="492DB0C3">
+              <v:rect id="shape_0" ID="Caixa de Texto 16" path="m0,0l-2147483645,0l-2147483645,-2147483646l0,-2147483646xe" stroked="f" o:allowincell="f" style="position:absolute;margin-left:1.65pt;margin-top:161.45pt;width:303.55pt;height:23.75pt;mso-wrap-style:square;v-text-anchor:top" wp14:anchorId="492DB0C3">
                 <v:fill o:detectmouseclick="t" on="false"/>
                 <v:stroke color="#3465a4" joinstyle="round" endcap="flat"/>
                 <v:textbox>
                   <w:txbxContent>
                     <w:p>
                       <w:pPr>
-                        <w:pStyle w:val="Contedodoquadrouser"/>
+                        <w:pStyle w:val="Contedodoquadro"/>
                         <w:rPr/>
                       </w:pPr>
                       <w:r>
@@ -921,115 +1005,7 @@
       </w:r>
       <w:r>
         <w:rPr/>
-        <w:t>, _______________________________________________________, de nacionalidade __________________________, RG ________________, órgão emissor ___</w:t>
-      </w:r>
-      <w:r>
-        <mc:AlternateContent>
-          <mc:Choice Requires="wps">
-            <w:drawing>
-              <wp:anchor distT="0" distB="1270" distL="0" distR="0" simplePos="0" relativeHeight="32" behindDoc="0" locked="0" layoutInCell="1" allowOverlap="1" wp14:anchorId="72133C8F">
-                <wp:simplePos x="0" y="0"/>
-                <wp:positionH relativeFrom="column">
-                  <wp:posOffset>481330</wp:posOffset>
-                </wp:positionH>
-                <wp:positionV relativeFrom="paragraph">
-                  <wp:posOffset>638175</wp:posOffset>
-                </wp:positionV>
-                <wp:extent cx="1035050" cy="284480"/>
-                <wp:effectExtent l="0" t="0" r="0" b="1270"/>
-                <wp:wrapNone/>
-                <wp:docPr id="11" name="Caixa de Texto 3"/>
-                <a:graphic xmlns:a="http://schemas.openxmlformats.org/drawingml/2006/main">
-                  <a:graphicData uri="http://schemas.microsoft.com/office/word/2010/wordprocessingShape">
-                    <wps:wsp>
-                      <wps:cNvSpPr/>
-                      <wps:spPr>
-                        <a:xfrm>
-                          <a:off x="0" y="0"/>
-                          <a:ext cx="1035000" cy="284400"/>
-                        </a:xfrm>
-                        <a:prstGeom prst="rect">
-                          <a:avLst/>
-                        </a:prstGeom>
-                        <a:noFill/>
-                        <a:ln w="0">
-                          <a:noFill/>
-                        </a:ln>
-                      </wps:spPr>
-                      <wps:style>
-                        <a:lnRef idx="0"/>
-                        <a:fillRef idx="0"/>
-                        <a:effectRef idx="0"/>
-                        <a:fontRef idx="minor"/>
-                      </wps:style>
-                      <wps:txbx>
-                        <w:txbxContent>
-                          <w:p>
-                            <w:pPr>
-                              <w:pStyle w:val="Contedodoquadrouser"/>
-                              <w:rPr/>
-                            </w:pPr>
-                            <w:r>
-                              <w:rPr/>
-                              <w:t>${</w:t>
-                            </w:r>
-                            <w:r>
-                              <w:rPr/>
-                              <w:t>RG_</w:t>
-                            </w:r>
-                            <w:r>
-                              <w:rPr/>
-                              <w:t>ISSUER}</w:t>
-                            </w:r>
-                          </w:p>
-                        </w:txbxContent>
-                      </wps:txbx>
-                      <wps:bodyPr anchor="t">
-                        <a:prstTxWarp prst="textNoShape"/>
-                        <a:noAutofit/>
-                      </wps:bodyPr>
-                    </wps:wsp>
-                  </a:graphicData>
-                </a:graphic>
-              </wp:anchor>
-            </w:drawing>
-          </mc:Choice>
-          <mc:Fallback>
-            <w:pict>
-              <v:rect id="shape_0" stroked="f" o:allowincell="f" style="position:absolute;margin-left:37.9pt;margin-top:50.25pt;width:81.45pt;height:22.35pt;mso-wrap-style:square;v-text-anchor:top" wp14:anchorId="72133C8F">
-                <v:fill o:detectmouseclick="t" on="false"/>
-                <v:stroke color="#3465a4" joinstyle="round" endcap="flat"/>
-                <v:textbox>
-                  <w:txbxContent>
-                    <w:p>
-                      <w:pPr>
-                        <w:pStyle w:val="Contedodoquadrouser"/>
-                        <w:rPr/>
-                      </w:pPr>
-                      <w:r>
-                        <w:rPr/>
-                        <w:t>${</w:t>
-                      </w:r>
-                      <w:r>
-                        <w:rPr/>
-                        <w:t>RG_</w:t>
-                      </w:r>
-                      <w:r>
-                        <w:rPr/>
-                        <w:t>ISSUER}</w:t>
-                      </w:r>
-                    </w:p>
-                  </w:txbxContent>
-                </v:textbox>
-                <w10:wrap type="none"/>
-              </v:rect>
-            </w:pict>
-          </mc:Fallback>
-        </mc:AlternateContent>
-      </w:r>
-      <w:r>
-        <w:rPr/>
-        <w:t xml:space="preserve">____, CPF __________________, </w:t>
+        <w:t xml:space="preserve">, _______________________________________________________, de nacionalidade __________________________, RG ________________, órgão emissor _______, CPF __________________, </w:t>
       </w:r>
       <w:r>
         <w:rPr>
@@ -1066,14 +1042,17 @@
       <w:pPr>
         <w:pStyle w:val="Normal"/>
         <w:spacing w:lineRule="auto" w:line="259" w:before="0" w:after="389"/>
-        <w:jc w:val="start"/>
-        <w:rPr/>
+        <w:jc w:val="left"/>
+        <w:rPr>
+          <w:b/>
+          <w:bCs/>
+        </w:rPr>
       </w:pPr>
       <w:r>
         <mc:AlternateContent>
           <mc:Choice Requires="wps">
             <w:drawing>
-              <wp:anchor distT="0" distB="5080" distL="0" distR="0" simplePos="0" relativeHeight="16" behindDoc="0" locked="0" layoutInCell="1" allowOverlap="1" wp14:anchorId="1F4E45FE">
+              <wp:anchor behindDoc="0" distT="0" distB="5080" distL="0" distR="0" simplePos="0" locked="0" layoutInCell="1" allowOverlap="1" relativeHeight="22" wp14:anchorId="1F4E45FE">
                 <wp:simplePos x="0" y="0"/>
                 <wp:positionH relativeFrom="column">
                   <wp:posOffset>307340</wp:posOffset>
@@ -1112,7 +1091,7 @@
                         <w:txbxContent>
                           <w:p>
                             <w:pPr>
-                              <w:pStyle w:val="Contedodoquadrouser"/>
+                              <w:pStyle w:val="Contedodoquadro"/>
                               <w:rPr/>
                             </w:pPr>
                             <w:r>
@@ -1134,14 +1113,14 @@
           </mc:Choice>
           <mc:Fallback>
             <w:pict>
-              <v:rect id="shape_0" stroked="f" o:allowincell="f" style="position:absolute;margin-left:24.2pt;margin-top:29.9pt;width:128.35pt;height:32.55pt;mso-wrap-style:square;v-text-anchor:top" wp14:anchorId="1F4E45FE">
+              <v:rect id="shape_0" ID="Caixa de Texto 12" path="m0,0l-2147483645,0l-2147483645,-2147483646l0,-2147483646xe" stroked="f" o:allowincell="f" style="position:absolute;margin-left:24.2pt;margin-top:29.9pt;width:128.35pt;height:32.55pt;mso-wrap-style:square;v-text-anchor:top" wp14:anchorId="1F4E45FE">
                 <v:fill o:detectmouseclick="t" on="false"/>
                 <v:stroke color="#3465a4" joinstyle="round" endcap="flat"/>
                 <v:textbox>
                   <w:txbxContent>
                     <w:p>
                       <w:pPr>
-                        <w:pStyle w:val="Contedodoquadrouser"/>
+                        <w:pStyle w:val="Contedodoquadro"/>
                         <w:rPr/>
                       </w:pPr>
                       <w:r>
@@ -1159,7 +1138,7 @@
         <mc:AlternateContent>
           <mc:Choice Requires="wps">
             <w:drawing>
-              <wp:anchor distT="0" distB="0" distL="0" distR="0" simplePos="0" relativeHeight="18" behindDoc="0" locked="0" layoutInCell="1" allowOverlap="1" wp14:anchorId="55E8B8D8">
+              <wp:anchor behindDoc="0" distT="0" distB="0" distL="0" distR="0" simplePos="0" locked="0" layoutInCell="1" allowOverlap="1" relativeHeight="24" wp14:anchorId="55E8B8D8">
                 <wp:simplePos x="0" y="0"/>
                 <wp:positionH relativeFrom="column">
                   <wp:posOffset>2005330</wp:posOffset>
@@ -1198,7 +1177,7 @@
                         <w:txbxContent>
                           <w:p>
                             <w:pPr>
-                              <w:pStyle w:val="Contedodoquadrouser"/>
+                              <w:pStyle w:val="Contedodoquadro"/>
                               <w:rPr/>
                             </w:pPr>
                             <w:r>
@@ -1220,14 +1199,14 @@
           </mc:Choice>
           <mc:Fallback>
             <w:pict>
-              <v:rect id="shape_0" stroked="f" o:allowincell="f" style="position:absolute;margin-left:157.9pt;margin-top:28.9pt;width:57.7pt;height:24.4pt;mso-wrap-style:square;v-text-anchor:top" wp14:anchorId="55E8B8D8">
+              <v:rect id="shape_0" ID="Caixa de Texto 13" path="m0,0l-2147483645,0l-2147483645,-2147483646l0,-2147483646xe" stroked="f" o:allowincell="f" style="position:absolute;margin-left:157.9pt;margin-top:28.9pt;width:57.7pt;height:24.4pt;mso-wrap-style:square;v-text-anchor:top" wp14:anchorId="55E8B8D8">
                 <v:fill o:detectmouseclick="t" on="false"/>
                 <v:stroke color="#3465a4" joinstyle="round" endcap="flat"/>
                 <v:textbox>
                   <w:txbxContent>
                     <w:p>
                       <w:pPr>
-                        <w:pStyle w:val="Contedodoquadrouser"/>
+                        <w:pStyle w:val="Contedodoquadro"/>
                         <w:rPr/>
                       </w:pPr>
                       <w:r>
@@ -1245,7 +1224,7 @@
         <mc:AlternateContent>
           <mc:Choice Requires="wps">
             <w:drawing>
-              <wp:anchor distT="0" distB="0" distL="0" distR="0" simplePos="0" relativeHeight="20" behindDoc="0" locked="0" layoutInCell="1" allowOverlap="1" wp14:anchorId="105955CE">
+              <wp:anchor behindDoc="0" distT="0" distB="0" distL="0" distR="0" simplePos="0" locked="0" layoutInCell="1" allowOverlap="1" relativeHeight="26" wp14:anchorId="105955CE">
                 <wp:simplePos x="0" y="0"/>
                 <wp:positionH relativeFrom="column">
                   <wp:posOffset>2704465</wp:posOffset>
@@ -1284,7 +1263,7 @@
                         <w:txbxContent>
                           <w:p>
                             <w:pPr>
-                              <w:pStyle w:val="Contedodoquadrouser"/>
+                              <w:pStyle w:val="Contedodoquadro"/>
                               <w:rPr/>
                             </w:pPr>
                             <w:r>
@@ -1306,14 +1285,14 @@
           </mc:Choice>
           <mc:Fallback>
             <w:pict>
-              <v:rect id="shape_0" stroked="f" o:allowincell="f" style="position:absolute;margin-left:212.95pt;margin-top:29.7pt;width:94.35pt;height:24.4pt;mso-wrap-style:square;v-text-anchor:top" wp14:anchorId="105955CE">
+              <v:rect id="shape_0" ID="Caixa de Texto 14" path="m0,0l-2147483645,0l-2147483645,-2147483646l0,-2147483646xe" stroked="f" o:allowincell="f" style="position:absolute;margin-left:212.95pt;margin-top:29.7pt;width:94.35pt;height:24.4pt;mso-wrap-style:square;v-text-anchor:top" wp14:anchorId="105955CE">
                 <v:fill o:detectmouseclick="t" on="false"/>
                 <v:stroke color="#3465a4" joinstyle="round" endcap="flat"/>
                 <v:textbox>
                   <w:txbxContent>
                     <w:p>
                       <w:pPr>
-                        <w:pStyle w:val="Contedodoquadrouser"/>
+                        <w:pStyle w:val="Contedodoquadro"/>
                         <w:rPr/>
                       </w:pPr>
                       <w:r>
@@ -1331,7 +1310,7 @@
         <mc:AlternateContent>
           <mc:Choice Requires="wps">
             <w:drawing>
-              <wp:anchor distT="0" distB="3175" distL="0" distR="0" simplePos="0" relativeHeight="22" behindDoc="0" locked="0" layoutInCell="1" allowOverlap="1" wp14:anchorId="317DD299">
+              <wp:anchor behindDoc="0" distT="0" distB="3175" distL="0" distR="0" simplePos="0" locked="0" layoutInCell="1" allowOverlap="1" relativeHeight="28" wp14:anchorId="317DD299">
                 <wp:simplePos x="0" y="0"/>
                 <wp:positionH relativeFrom="column">
                   <wp:posOffset>4403725</wp:posOffset>
@@ -1370,7 +1349,7 @@
                         <w:txbxContent>
                           <w:p>
                             <w:pPr>
-                              <w:pStyle w:val="Contedodoquadrouser"/>
+                              <w:pStyle w:val="Contedodoquadro"/>
                               <w:rPr/>
                             </w:pPr>
                             <w:r>
@@ -1392,14 +1371,14 @@
           </mc:Choice>
           <mc:Fallback>
             <w:pict>
-              <v:rect id="shape_0" stroked="f" o:allowincell="f" style="position:absolute;margin-left:346.75pt;margin-top:30.35pt;width:67.85pt;height:23.7pt;mso-wrap-style:square;v-text-anchor:top" wp14:anchorId="317DD299">
+              <v:rect id="shape_0" ID="Caixa de Texto 15" path="m0,0l-2147483645,0l-2147483645,-2147483646l0,-2147483646xe" stroked="f" o:allowincell="f" style="position:absolute;margin-left:346.75pt;margin-top:30.35pt;width:67.85pt;height:23.7pt;mso-wrap-style:square;v-text-anchor:top" wp14:anchorId="317DD299">
                 <v:fill o:detectmouseclick="t" on="false"/>
                 <v:stroke color="#3465a4" joinstyle="round" endcap="flat"/>
                 <v:textbox>
                   <w:txbxContent>
                     <w:p>
                       <w:pPr>
-                        <w:pStyle w:val="Contedodoquadrouser"/>
+                        <w:pStyle w:val="Contedodoquadro"/>
                         <w:rPr/>
                       </w:pPr>
                       <w:r>
@@ -1425,8 +1404,8 @@
     <w:p>
       <w:pPr>
         <w:pStyle w:val="Normal"/>
-        <w:spacing w:lineRule="auto" w:line="262" w:before="0" w:after="449"/>
-        <w:ind w:hanging="10" w:start="10" w:end="4"/>
+        <w:spacing w:lineRule="auto" w:line="259" w:before="0" w:after="449"/>
+        <w:ind w:hanging="10" w:left="10" w:right="4"/>
         <w:jc w:val="center"/>
         <w:rPr/>
       </w:pPr>
@@ -1439,7 +1418,7 @@
       <w:pPr>
         <w:pStyle w:val="Normal"/>
         <w:spacing w:lineRule="auto" w:line="259" w:before="0" w:after="420"/>
-        <w:jc w:val="start"/>
+        <w:jc w:val="left"/>
         <w:rPr/>
       </w:pPr>
       <w:r>
@@ -1452,8 +1431,8 @@
     <w:p>
       <w:pPr>
         <w:pStyle w:val="Normal"/>
-        <w:spacing w:lineRule="auto" w:line="262" w:before="0" w:after="156"/>
-        <w:ind w:hanging="10" w:start="10" w:end="6"/>
+        <w:spacing w:lineRule="auto" w:line="259" w:before="0" w:after="156"/>
+        <w:ind w:hanging="10" w:left="10" w:right="6"/>
         <w:jc w:val="center"/>
         <w:rPr/>
       </w:pPr>
@@ -1461,7 +1440,7 @@
         <mc:AlternateContent>
           <mc:Choice Requires="wps">
             <w:drawing>
-              <wp:anchor distT="0" distB="1270" distL="0" distR="0" simplePos="0" relativeHeight="30" behindDoc="0" locked="0" layoutInCell="0" allowOverlap="1" wp14:anchorId="1D36E4D1">
+              <wp:anchor behindDoc="0" distT="0" distB="1270" distL="0" distR="0" simplePos="0" locked="0" layoutInCell="0" allowOverlap="1" relativeHeight="32" wp14:anchorId="1D36E4D1">
                 <wp:simplePos x="0" y="0"/>
                 <wp:positionH relativeFrom="margin">
                   <wp:posOffset>1417955</wp:posOffset>
@@ -1500,7 +1479,7 @@
                         <w:txbxContent>
                           <w:p>
                             <w:pPr>
-                              <w:pStyle w:val="Contedodoquadrouser"/>
+                              <w:pStyle w:val="Contedodoquadro"/>
                               <w:rPr/>
                             </w:pPr>
                             <w:r>
@@ -1510,7 +1489,7 @@
                           </w:p>
                           <w:p>
                             <w:pPr>
-                              <w:pStyle w:val="Contedodoquadrouser"/>
+                              <w:pStyle w:val="Contedodoquadro"/>
                               <w:rPr/>
                             </w:pPr>
                             <w:r>
@@ -1531,14 +1510,14 @@
           </mc:Choice>
           <mc:Fallback>
             <w:pict>
-              <v:rect id="shape_0" stroked="f" o:allowincell="f" style="position:absolute;margin-left:111.65pt;margin-top:11.4pt;width:256.05pt;height:22.35pt;mso-wrap-style:square;v-text-anchor:top;mso-position-horizontal-relative:margin" wp14:anchorId="1D36E4D1">
+              <v:rect id="shape_0" ID="Caixa de Texto 17" path="m0,0l-2147483645,0l-2147483645,-2147483646l0,-2147483646xe" stroked="f" o:allowincell="f" style="position:absolute;margin-left:111.65pt;margin-top:11.4pt;width:256.05pt;height:22.35pt;mso-wrap-style:square;v-text-anchor:top;mso-position-horizontal-relative:margin" wp14:anchorId="1D36E4D1">
                 <v:fill o:detectmouseclick="t" on="false"/>
                 <v:stroke color="#3465a4" joinstyle="round" endcap="flat"/>
                 <v:textbox>
                   <w:txbxContent>
                     <w:p>
                       <w:pPr>
-                        <w:pStyle w:val="Contedodoquadrouser"/>
+                        <w:pStyle w:val="Contedodoquadro"/>
                         <w:rPr/>
                       </w:pPr>
                       <w:r>
@@ -1548,7 +1527,7 @@
                     </w:p>
                     <w:p>
                       <w:pPr>
-                        <w:pStyle w:val="Contedodoquadrouser"/>
+                        <w:pStyle w:val="Contedodoquadro"/>
                         <w:rPr/>
                       </w:pPr>
                       <w:r>
@@ -1999,7 +1978,7 @@
     </w:rPr>
   </w:style>
   <w:style w:type="paragraph" w:styleId="Heading1">
-    <w:name w:val="heading 1"/>
+    <w:name w:val="Heading 1"/>
     <w:next w:val="Normal"/>
     <w:link w:val="Ttulo1Char"/>
     <w:uiPriority w:val="9"/>
@@ -2011,7 +1990,7 @@
       <w:suppressAutoHyphens w:val="true"/>
       <w:bidi w:val="0"/>
       <w:spacing w:lineRule="auto" w:line="259" w:before="0" w:after="0"/>
-      <w:ind w:end="2"/>
+      <w:ind w:right="2"/>
       <w:jc w:val="center"/>
       <w:outlineLvl w:val="0"/>
     </w:pPr>
@@ -2029,10 +2008,12 @@
     <w:uiPriority w:val="1"/>
     <w:semiHidden/>
     <w:unhideWhenUsed/>
+    <w:qFormat/>
     <w:rPr/>
   </w:style>
   <w:style w:type="character" w:styleId="Ttulo1Char" w:customStyle="1">
     <w:name w:val="Título 1 Char"/>
+    <w:qFormat/>
     <w:rPr>
       <w:rFonts w:ascii="Arial" w:hAnsi="Arial" w:eastAsia="Arial" w:cs="Arial"/>
       <w:color w:val="000000"/>
@@ -2043,12 +2024,13 @@
     <w:name w:val="Título"/>
     <w:basedOn w:val="Normal"/>
     <w:next w:val="BodyText"/>
+    <w:qFormat/>
     <w:pPr>
       <w:keepNext w:val="true"/>
       <w:spacing w:before="240" w:after="120"/>
     </w:pPr>
     <w:rPr>
-      <w:rFonts w:ascii="Liberation Sans" w:hAnsi="Liberation Sans" w:eastAsia="Microsoft YaHei" w:cs="Lucida Sans"/>
+      <w:rFonts w:ascii="Liberation Sans" w:hAnsi="Liberation Sans" w:eastAsia="Noto Sans CJK SC" w:cs="Noto Sans Devanagari"/>
       <w:sz w:val="28"/>
       <w:szCs w:val="28"/>
     </w:rPr>
@@ -2066,18 +2048,19 @@
     <w:basedOn w:val="BodyText"/>
     <w:pPr/>
     <w:rPr>
-      <w:rFonts w:cs="Lucida Sans"/>
+      <w:rFonts w:cs="Noto Sans Devanagari"/>
     </w:rPr>
   </w:style>
   <w:style w:type="paragraph" w:styleId="Caption">
-    <w:name w:val="caption"/>
+    <w:name w:val="Caption"/>
     <w:basedOn w:val="Normal"/>
+    <w:qFormat/>
     <w:pPr>
       <w:suppressLineNumbers/>
       <w:spacing w:before="120" w:after="120"/>
     </w:pPr>
     <w:rPr>
-      <w:rFonts w:cs="Lucida Sans"/>
+      <w:rFonts w:cs="Noto Sans Devanagari"/>
       <w:i/>
       <w:iCs/>
       <w:sz w:val="24"/>
@@ -2087,54 +2070,27 @@
   <w:style w:type="paragraph" w:styleId="ndice">
     <w:name w:val="Índice"/>
     <w:basedOn w:val="Normal"/>
+    <w:qFormat/>
     <w:pPr>
       <w:suppressLineNumbers/>
     </w:pPr>
     <w:rPr>
-      <w:rFonts w:cs="Lucida Sans"/>
+      <w:rFonts w:cs="Noto Sans Devanagari"/>
     </w:rPr>
-  </w:style>
-  <w:style w:type="paragraph" w:styleId="Ttulouser">
-    <w:name w:val="Título (user)"/>
-    <w:basedOn w:val="Normal"/>
-    <w:next w:val="BodyText"/>
-    <w:pPr>
-      <w:keepNext w:val="true"/>
-      <w:spacing w:before="240" w:after="120"/>
-    </w:pPr>
-    <w:rPr>
-      <w:rFonts w:ascii="Liberation Sans" w:hAnsi="Liberation Sans" w:eastAsia="Microsoft YaHei" w:cs="Lucida Sans"/>
-      <w:sz w:val="28"/>
-      <w:szCs w:val="28"/>
-    </w:rPr>
-  </w:style>
-  <w:style w:type="paragraph" w:styleId="ndiceuser">
-    <w:name w:val="Índice (user)"/>
-    <w:basedOn w:val="Normal"/>
-    <w:pPr>
-      <w:suppressLineNumbers/>
-    </w:pPr>
-    <w:rPr>
-      <w:rFonts w:cs="Lucida Sans"/>
-    </w:rPr>
-  </w:style>
-  <w:style w:type="paragraph" w:styleId="Contedodoquadrouser">
-    <w:name w:val="Conteúdo do quadro (user)"/>
-    <w:basedOn w:val="Normal"/>
-    <w:pPr/>
-    <w:rPr/>
   </w:style>
   <w:style w:type="paragraph" w:styleId="Contedodoquadro">
     <w:name w:val="Conteúdo do quadro"/>
     <w:basedOn w:val="Normal"/>
+    <w:qFormat/>
     <w:pPr/>
     <w:rPr/>
   </w:style>
-  <w:style w:type="numbering" w:styleId="Semlistauser" w:default="1">
-    <w:name w:val="Sem lista (user)"/>
+  <w:style w:type="numbering" w:styleId="Semlista" w:default="1">
+    <w:name w:val="Sem lista"/>
     <w:uiPriority w:val="99"/>
     <w:semiHidden/>
     <w:unhideWhenUsed/>
+    <w:qFormat/>
   </w:style>
   <w:style w:type="table" w:default="1" w:styleId="Tabelanormal">
     <w:name w:val="Normal Table"/>
@@ -2161,37 +2117,37 @@
         <a:srgbClr val="000000"/>
       </a:dk1>
       <a:lt1>
-        <a:srgbClr val="FFFFFF"/>
+        <a:srgbClr val="ffffff"/>
       </a:lt1>
       <a:dk2>
-        <a:srgbClr val="44546A"/>
+        <a:srgbClr val="44546a"/>
       </a:dk2>
       <a:lt2>
-        <a:srgbClr val="E7E6E6"/>
+        <a:srgbClr val="e7e6e6"/>
       </a:lt2>
       <a:accent1>
-        <a:srgbClr val="4472C4"/>
+        <a:srgbClr val="4472c4"/>
       </a:accent1>
       <a:accent2>
-        <a:srgbClr val="ED7D31"/>
+        <a:srgbClr val="ed7d31"/>
       </a:accent2>
       <a:accent3>
-        <a:srgbClr val="A5A5A5"/>
+        <a:srgbClr val="a5a5a5"/>
       </a:accent3>
       <a:accent4>
-        <a:srgbClr val="FFC000"/>
+        <a:srgbClr val="ffc000"/>
       </a:accent4>
       <a:accent5>
-        <a:srgbClr val="5B9BD5"/>
+        <a:srgbClr val="5b9bd5"/>
       </a:accent5>
       <a:accent6>
-        <a:srgbClr val="70AD47"/>
+        <a:srgbClr val="70ad47"/>
       </a:accent6>
       <a:hlink>
-        <a:srgbClr val="0563C1"/>
+        <a:srgbClr val="0563c1"/>
       </a:hlink>
       <a:folHlink>
-        <a:srgbClr val="954F72"/>
+        <a:srgbClr val="954f72"/>
       </a:folHlink>
     </a:clrScheme>
     <a:fontScheme name="Office">
@@ -2199,105 +2155,11 @@
         <a:latin typeface="Calibri Light" panose="020F0302020204030204" pitchFamily="0" charset="1"/>
         <a:ea typeface=""/>
         <a:cs typeface=""/>
-        <a:font script="Jpan" typeface="游ゴシック Light"/>
-        <a:font script="Hang" typeface="맑은 고딕"/>
-        <a:font script="Hans" typeface="等线 Light"/>
-        <a:font script="Hant" typeface="新細明體"/>
-        <a:font script="Arab" typeface="Times New Roman"/>
-        <a:font script="Hebr" typeface="Times New Roman"/>
-        <a:font script="Thai" typeface="Angsana New"/>
-        <a:font script="Ethi" typeface="Nyala"/>
-        <a:font script="Beng" typeface="Vrinda"/>
-        <a:font script="Gujr" typeface="Shruti"/>
-        <a:font script="Khmr" typeface="MoolBoran"/>
-        <a:font script="Knda" typeface="Tunga"/>
-        <a:font script="Guru" typeface="Raavi"/>
-        <a:font script="Cans" typeface="Euphemia"/>
-        <a:font script="Cher" typeface="Plantagenet Cherokee"/>
-        <a:font script="Yiii" typeface="Microsoft Yi Baiti"/>
-        <a:font script="Tibt" typeface="Microsoft Himalaya"/>
-        <a:font script="Thaa" typeface="MV Boli"/>
-        <a:font script="Deva" typeface="Mangal"/>
-        <a:font script="Telu" typeface="Gautami"/>
-        <a:font script="Taml" typeface="Latha"/>
-        <a:font script="Syrc" typeface="Estrangelo Edessa"/>
-        <a:font script="Orya" typeface="Kalinga"/>
-        <a:font script="Mlym" typeface="Kartika"/>
-        <a:font script="Laoo" typeface="DokChampa"/>
-        <a:font script="Sinh" typeface="Iskoola Pota"/>
-        <a:font script="Mong" typeface="Mongolian Baiti"/>
-        <a:font script="Viet" typeface="Times New Roman"/>
-        <a:font script="Uigh" typeface="Microsoft Uighur"/>
-        <a:font script="Geor" typeface="Sylfaen"/>
-        <a:font script="Armn" typeface="Arial"/>
-        <a:font script="Bugi" typeface="Leelawadee UI"/>
-        <a:font script="Bopo" typeface="Microsoft JhengHei"/>
-        <a:font script="Java" typeface="Javanese Text"/>
-        <a:font script="Lisu" typeface="Segoe UI"/>
-        <a:font script="Mymr" typeface="Myanmar Text"/>
-        <a:font script="Nkoo" typeface="Ebrima"/>
-        <a:font script="Olck" typeface="Nirmala UI"/>
-        <a:font script="Osma" typeface="Ebrima"/>
-        <a:font script="Phag" typeface="Phagspa"/>
-        <a:font script="Syrn" typeface="Estrangelo Edessa"/>
-        <a:font script="Syrj" typeface="Estrangelo Edessa"/>
-        <a:font script="Syre" typeface="Estrangelo Edessa"/>
-        <a:font script="Sora" typeface="Nirmala UI"/>
-        <a:font script="Tale" typeface="Microsoft Tai Le"/>
-        <a:font script="Talu" typeface="Microsoft New Tai Lue"/>
-        <a:font script="Tfng" typeface="Ebrima"/>
       </a:majorFont>
       <a:minorFont>
         <a:latin typeface="Calibri" panose="020F0502020204030204" pitchFamily="0" charset="1"/>
         <a:ea typeface=""/>
         <a:cs typeface=""/>
-        <a:font script="Jpan" typeface="游明朝"/>
-        <a:font script="Hang" typeface="맑은 고딕"/>
-        <a:font script="Hans" typeface="等线"/>
-        <a:font script="Hant" typeface="新細明體"/>
-        <a:font script="Arab" typeface="Arial"/>
-        <a:font script="Hebr" typeface="Arial"/>
-        <a:font script="Thai" typeface="Cordia New"/>
-        <a:font script="Ethi" typeface="Nyala"/>
-        <a:font script="Beng" typeface="Vrinda"/>
-        <a:font script="Gujr" typeface="Shruti"/>
-        <a:font script="Khmr" typeface="DaunPenh"/>
-        <a:font script="Knda" typeface="Tunga"/>
-        <a:font script="Guru" typeface="Raavi"/>
-        <a:font script="Cans" typeface="Euphemia"/>
-        <a:font script="Cher" typeface="Plantagenet Cherokee"/>
-        <a:font script="Yiii" typeface="Microsoft Yi Baiti"/>
-        <a:font script="Tibt" typeface="Microsoft Himalaya"/>
-        <a:font script="Thaa" typeface="MV Boli"/>
-        <a:font script="Deva" typeface="Mangal"/>
-        <a:font script="Telu" typeface="Gautami"/>
-        <a:font script="Taml" typeface="Latha"/>
-        <a:font script="Syrc" typeface="Estrangelo Edessa"/>
-        <a:font script="Orya" typeface="Kalinga"/>
-        <a:font script="Mlym" typeface="Kartika"/>
-        <a:font script="Laoo" typeface="DokChampa"/>
-        <a:font script="Sinh" typeface="Iskoola Pota"/>
-        <a:font script="Mong" typeface="Mongolian Baiti"/>
-        <a:font script="Viet" typeface="Arial"/>
-        <a:font script="Uigh" typeface="Microsoft Uighur"/>
-        <a:font script="Geor" typeface="Sylfaen"/>
-        <a:font script="Armn" typeface="Arial"/>
-        <a:font script="Bugi" typeface="Leelawadee UI"/>
-        <a:font script="Bopo" typeface="Microsoft JhengHei"/>
-        <a:font script="Java" typeface="Javanese Text"/>
-        <a:font script="Lisu" typeface="Segoe UI"/>
-        <a:font script="Mymr" typeface="Myanmar Text"/>
-        <a:font script="Nkoo" typeface="Ebrima"/>
-        <a:font script="Olck" typeface="Nirmala UI"/>
-        <a:font script="Osma" typeface="Ebrima"/>
-        <a:font script="Phag" typeface="Phagspa"/>
-        <a:font script="Syrn" typeface="Estrangelo Edessa"/>
-        <a:font script="Syrj" typeface="Estrangelo Edessa"/>
-        <a:font script="Syre" typeface="Estrangelo Edessa"/>
-        <a:font script="Sora" typeface="Nirmala UI"/>
-        <a:font script="Tale" typeface="Microsoft Tai Le"/>
-        <a:font script="Talu" typeface="Microsoft New Tai Lue"/>
-        <a:font script="Tfng" typeface="Ebrima"/>
       </a:minorFont>
     </a:fontScheme>
     <a:fmtScheme>

</xml_diff>